<commit_message>
doc: actualizando el informe de avancedel proyecto
</commit_message>
<xml_diff>
--- a/reports/Informe_Avance_Proyecto_YPF.docx
+++ b/reports/Informe_Avance_Proyecto_YPF.docx
@@ -59,7 +59,7 @@
           <w:sz w:val="22"/>
           <w:szCs w:val="22"/>
         </w:rPr>
-        <w:t xml:space="preserve">Período: 3 al 14 de septiembre de 2026</w:t>
+        <w:t xml:space="preserve">Período: 3 de septiembre al 10 de octubre de 2026</w:t>
       </w:r>
     </w:p>
     <w:p>
@@ -75,7 +75,7 @@
           <w:sz w:val="22"/>
           <w:szCs w:val="22"/>
         </w:rPr>
-        <w:t xml:space="preserve">Etapa actual: Pre-Entrega 3 (Modelado Supervisado) — CERRADA, incluyendo comparación XGBoost vs. LightGBM. Próximo paso: Modelado No Supervisado (clustering).</w:t>
+        <w:t xml:space="preserve">Etapa actual: Modelado No Supervisado (clustering K-Means) — CERRADO, tras corregir una primera versión con outliers. Próximo paso: explicabilidad (SHAP) y Entrega Final.</w:t>
       </w:r>
     </w:p>
     <w:p>
@@ -8362,23 +8362,124 @@
           <w:sz w:val="30"/>
           <w:szCs w:val="30"/>
         </w:rPr>
-        <w:t xml:space="preserve">11. Próximos pasos</w:t>
-      </w:r>
-    </w:p>
-    <w:p>
-      <w:pPr>
-        <w:spacing w:after="120"/>
-        <w:ind w:left="200"/>
-      </w:pPr>
-      <w:r>
-        <w:rPr>
+        <w:t xml:space="preserve">11. </w:t>
+      </w:r>
+      <w:r>
+        <w:rPr>
+          <w:rFonts w:ascii="Consolas" w:cs="Consolas" w:eastAsia="Consolas" w:hAnsi="Consolas"/>
           <w:b/>
           <w:bCs/>
           <w:color w:val="1F3864"/>
-          <w:sz w:val="22"/>
-          <w:szCs w:val="22"/>
-        </w:rPr>
-        <w:t xml:space="preserve">1. </w:t>
+          <w:sz w:val="30"/>
+          <w:szCs w:val="30"/>
+        </w:rPr>
+        <w:t xml:space="preserve">notebooks/04_modelado_no_supervisado.ipynb</w:t>
+      </w:r>
+      <w:r>
+        <w:rPr>
+          <w:b/>
+          <w:bCs/>
+          <w:i w:val="false"/>
+          <w:iCs w:val="false"/>
+          <w:color w:val="1F3864"/>
+          <w:sz w:val="30"/>
+          <w:szCs w:val="30"/>
+        </w:rPr>
+        <w:t xml:space="preserve"> — Clustering de pozos (K-Means)</w:t>
+      </w:r>
+    </w:p>
+    <w:p>
+      <w:pPr>
+        <w:pStyle w:val="Heading2"/>
+        <w:spacing w:after="140" w:before="280"/>
+      </w:pPr>
+      <w:r>
+        <w:rPr>
+          <w:b/>
+          <w:bCs/>
+          <w:i w:val="false"/>
+          <w:iCs w:val="false"/>
+          <w:color w:val="2E5395"/>
+          <w:sz w:val="24"/>
+          <w:szCs w:val="24"/>
+        </w:rPr>
+        <w:t xml:space="preserve">11.1 Diseño del experimento</w:t>
+      </w:r>
+    </w:p>
+    <w:p>
+      <w:pPr>
+        <w:spacing w:after="100"/>
+        <w:ind w:left="300"/>
+      </w:pPr>
+      <w:r>
+        <w:rPr>
+          <w:b/>
+          <w:bCs/>
+          <w:color w:val="1F3864"/>
+          <w:sz w:val="22"/>
+          <w:szCs w:val="22"/>
+        </w:rPr>
+        <w:t xml:space="preserve">• </w:t>
+      </w:r>
+      <w:r>
+        <w:rPr>
+          <w:b/>
+          <w:bCs/>
+          <w:i w:val="false"/>
+          <w:iCs w:val="false"/>
+          <w:sz w:val="22"/>
+          <w:szCs w:val="22"/>
+        </w:rPr>
+        <w:t xml:space="preserve">Objetivo:</w:t>
+      </w:r>
+      <w:r>
+        <w:rPr>
+          <w:b w:val="false"/>
+          <w:bCs w:val="false"/>
+          <w:i w:val="false"/>
+          <w:iCs w:val="false"/>
+          <w:sz w:val="22"/>
+          <w:szCs w:val="22"/>
+        </w:rPr>
+        <w:t xml:space="preserve"> agrupar los pozos según su comportamiento de producción y revisar si los pozos con picos muy altos (la limitación del modelo supervisado) forman un grupo propio.</w:t>
+      </w:r>
+    </w:p>
+    <w:p>
+      <w:pPr>
+        <w:spacing w:after="100"/>
+        <w:ind w:left="300"/>
+      </w:pPr>
+      <w:r>
+        <w:rPr>
+          <w:b/>
+          <w:bCs/>
+          <w:color w:val="1F3864"/>
+          <w:sz w:val="22"/>
+          <w:szCs w:val="22"/>
+        </w:rPr>
+        <w:t xml:space="preserve">• </w:t>
+      </w:r>
+      <w:r>
+        <w:rPr>
+          <w:b/>
+          <w:bCs/>
+          <w:i w:val="false"/>
+          <w:iCs w:val="false"/>
+          <w:sz w:val="22"/>
+          <w:szCs w:val="22"/>
+        </w:rPr>
+        <w:t xml:space="preserve">Unidad de análisis:</w:t>
+      </w:r>
+      <w:r>
+        <w:rPr>
+          <w:b w:val="false"/>
+          <w:bCs w:val="false"/>
+          <w:i w:val="false"/>
+          <w:iCs w:val="false"/>
+          <w:sz w:val="22"/>
+          <w:szCs w:val="22"/>
+        </w:rPr>
+        <w:t xml:space="preserve"> un pozo = una fila, resumido en 4 variables: </w:t>
       </w:r>
       <w:r>
         <w:rPr>
@@ -8390,18 +8491,3069 @@
           <w:szCs w:val="20"/>
           <w:shd w:fill="F0F0F0" w:val="clear"/>
         </w:rPr>
-        <w:t xml:space="preserve">notebooks/04_modelado_no_supervisado_dl.ipynb</w:t>
-      </w:r>
-      <w:r>
-        <w:rPr>
-          <w:b w:val="false"/>
-          <w:bCs w:val="false"/>
-          <w:i w:val="false"/>
-          <w:iCs w:val="false"/>
-          <w:sz w:val="22"/>
-          <w:szCs w:val="22"/>
-        </w:rPr>
-        <w:t xml:space="preserve">: clustering (K-Means) de pozos según su curva de producción/declinación — potencialmente informado por los pozos con picos que el modelo supervisado no logra predecir bien.</w:t>
+        <w:t xml:space="preserve">pico_prod_pet</w:t>
+      </w:r>
+      <w:r>
+        <w:rPr>
+          <w:b w:val="false"/>
+          <w:bCs w:val="false"/>
+          <w:i w:val="false"/>
+          <w:iCs w:val="false"/>
+          <w:sz w:val="22"/>
+          <w:szCs w:val="22"/>
+        </w:rPr>
+        <w:t xml:space="preserve"> (máximo histórico), </w:t>
+      </w:r>
+      <w:r>
+        <w:rPr>
+          <w:rFonts w:ascii="Consolas" w:cs="Consolas" w:eastAsia="Consolas" w:hAnsi="Consolas"/>
+          <w:b w:val="false"/>
+          <w:bCs w:val="false"/>
+          <w:color w:val="C0392B"/>
+          <w:sz w:val="20"/>
+          <w:szCs w:val="20"/>
+          <w:shd w:fill="F0F0F0" w:val="clear"/>
+        </w:rPr>
+        <w:t xml:space="preserve">declinacion_promedio</w:t>
+      </w:r>
+      <w:r>
+        <w:rPr>
+          <w:b w:val="false"/>
+          <w:bCs w:val="false"/>
+          <w:i w:val="false"/>
+          <w:iCs w:val="false"/>
+          <w:sz w:val="22"/>
+          <w:szCs w:val="22"/>
+        </w:rPr>
+        <w:t xml:space="preserve"> (declinación mensual típica, calculada con </w:t>
+      </w:r>
+      <w:r>
+        <w:rPr>
+          <w:rFonts w:ascii="Consolas" w:cs="Consolas" w:eastAsia="Consolas" w:hAnsi="Consolas"/>
+          <w:b w:val="false"/>
+          <w:bCs w:val="false"/>
+          <w:color w:val="C0392B"/>
+          <w:sz w:val="20"/>
+          <w:szCs w:val="20"/>
+          <w:shd w:fill="F0F0F0" w:val="clear"/>
+        </w:rPr>
+        <w:t xml:space="preserve">declinacion_pet_anterior</w:t>
+      </w:r>
+      <w:r>
+        <w:rPr>
+          <w:b w:val="false"/>
+          <w:bCs w:val="false"/>
+          <w:i w:val="false"/>
+          <w:iCs w:val="false"/>
+          <w:sz w:val="22"/>
+          <w:szCs w:val="22"/>
+        </w:rPr>
+        <w:t xml:space="preserve">), </w:t>
+      </w:r>
+      <w:r>
+        <w:rPr>
+          <w:rFonts w:ascii="Consolas" w:cs="Consolas" w:eastAsia="Consolas" w:hAnsi="Consolas"/>
+          <w:b w:val="false"/>
+          <w:bCs w:val="false"/>
+          <w:color w:val="C0392B"/>
+          <w:sz w:val="20"/>
+          <w:szCs w:val="20"/>
+          <w:shd w:fill="F0F0F0" w:val="clear"/>
+        </w:rPr>
+        <w:t xml:space="preserve">antiguedad_total</w:t>
+      </w:r>
+      <w:r>
+        <w:rPr>
+          <w:b w:val="false"/>
+          <w:bCs w:val="false"/>
+          <w:i w:val="false"/>
+          <w:iCs w:val="false"/>
+          <w:sz w:val="22"/>
+          <w:szCs w:val="22"/>
+        </w:rPr>
+        <w:t xml:space="preserve"> (meses de historia) y </w:t>
+      </w:r>
+      <w:r>
+        <w:rPr>
+          <w:rFonts w:ascii="Consolas" w:cs="Consolas" w:eastAsia="Consolas" w:hAnsi="Consolas"/>
+          <w:b w:val="false"/>
+          <w:bCs w:val="false"/>
+          <w:color w:val="C0392B"/>
+          <w:sz w:val="20"/>
+          <w:szCs w:val="20"/>
+          <w:shd w:fill="F0F0F0" w:val="clear"/>
+        </w:rPr>
+        <w:t xml:space="preserve">ratio_gas_pet_promedio</w:t>
+      </w:r>
+      <w:r>
+        <w:rPr>
+          <w:b w:val="false"/>
+          <w:bCs w:val="false"/>
+          <w:i w:val="false"/>
+          <w:iCs w:val="false"/>
+          <w:sz w:val="22"/>
+          <w:szCs w:val="22"/>
+        </w:rPr>
+        <w:t xml:space="preserve"> (relación gas/petróleo típica).</w:t>
+      </w:r>
+    </w:p>
+    <w:p>
+      <w:pPr>
+        <w:spacing w:after="100"/>
+        <w:ind w:left="300"/>
+      </w:pPr>
+      <w:r>
+        <w:rPr>
+          <w:b/>
+          <w:bCs/>
+          <w:color w:val="1F3864"/>
+          <w:sz w:val="22"/>
+          <w:szCs w:val="22"/>
+        </w:rPr>
+        <w:t xml:space="preserve">• </w:t>
+      </w:r>
+      <w:r>
+        <w:rPr>
+          <w:b/>
+          <w:bCs/>
+          <w:i w:val="false"/>
+          <w:iCs w:val="false"/>
+          <w:sz w:val="22"/>
+          <w:szCs w:val="22"/>
+        </w:rPr>
+        <w:t xml:space="preserve">Algoritmo:</w:t>
+      </w:r>
+      <w:r>
+        <w:rPr>
+          <w:b w:val="false"/>
+          <w:bCs w:val="false"/>
+          <w:i w:val="false"/>
+          <w:iCs w:val="false"/>
+          <w:sz w:val="22"/>
+          <w:szCs w:val="22"/>
+        </w:rPr>
+        <w:t xml:space="preserve"> K-Means con </w:t>
+      </w:r>
+      <w:r>
+        <w:rPr>
+          <w:rFonts w:ascii="Consolas" w:cs="Consolas" w:eastAsia="Consolas" w:hAnsi="Consolas"/>
+          <w:b w:val="false"/>
+          <w:bCs w:val="false"/>
+          <w:color w:val="C0392B"/>
+          <w:sz w:val="20"/>
+          <w:szCs w:val="20"/>
+          <w:shd w:fill="F0F0F0" w:val="clear"/>
+        </w:rPr>
+        <w:t xml:space="preserve">init="k-means++"</w:t>
+      </w:r>
+      <w:r>
+        <w:rPr>
+          <w:b w:val="false"/>
+          <w:bCs w:val="false"/>
+          <w:i w:val="false"/>
+          <w:iCs w:val="false"/>
+          <w:sz w:val="22"/>
+          <w:szCs w:val="22"/>
+        </w:rPr>
+        <w:t xml:space="preserve">, </w:t>
+      </w:r>
+      <w:r>
+        <w:rPr>
+          <w:rFonts w:ascii="Consolas" w:cs="Consolas" w:eastAsia="Consolas" w:hAnsi="Consolas"/>
+          <w:b w:val="false"/>
+          <w:bCs w:val="false"/>
+          <w:color w:val="C0392B"/>
+          <w:sz w:val="20"/>
+          <w:szCs w:val="20"/>
+          <w:shd w:fill="F0F0F0" w:val="clear"/>
+        </w:rPr>
+        <w:t xml:space="preserve">n_init=10</w:t>
+      </w:r>
+      <w:r>
+        <w:rPr>
+          <w:b w:val="false"/>
+          <w:bCs w:val="false"/>
+          <w:i w:val="false"/>
+          <w:iCs w:val="false"/>
+          <w:sz w:val="22"/>
+          <w:szCs w:val="22"/>
+        </w:rPr>
+        <w:t xml:space="preserve"> y </w:t>
+      </w:r>
+      <w:r>
+        <w:rPr>
+          <w:rFonts w:ascii="Consolas" w:cs="Consolas" w:eastAsia="Consolas" w:hAnsi="Consolas"/>
+          <w:b w:val="false"/>
+          <w:bCs w:val="false"/>
+          <w:color w:val="C0392B"/>
+          <w:sz w:val="20"/>
+          <w:szCs w:val="20"/>
+          <w:shd w:fill="F0F0F0" w:val="clear"/>
+        </w:rPr>
+        <w:t xml:space="preserve">random_state=42</w:t>
+      </w:r>
+      <w:r>
+        <w:rPr>
+          <w:b w:val="false"/>
+          <w:bCs w:val="false"/>
+          <w:i w:val="false"/>
+          <w:iCs w:val="false"/>
+          <w:sz w:val="22"/>
+          <w:szCs w:val="22"/>
+        </w:rPr>
+        <w:t xml:space="preserve">, sobre variables escaladas con </w:t>
+      </w:r>
+      <w:r>
+        <w:rPr>
+          <w:rFonts w:ascii="Consolas" w:cs="Consolas" w:eastAsia="Consolas" w:hAnsi="Consolas"/>
+          <w:b w:val="false"/>
+          <w:bCs w:val="false"/>
+          <w:color w:val="C0392B"/>
+          <w:sz w:val="20"/>
+          <w:szCs w:val="20"/>
+          <w:shd w:fill="F0F0F0" w:val="clear"/>
+        </w:rPr>
+        <w:t xml:space="preserve">StandardScaler</w:t>
+      </w:r>
+      <w:r>
+        <w:rPr>
+          <w:b w:val="false"/>
+          <w:bCs w:val="false"/>
+          <w:i w:val="false"/>
+          <w:iCs w:val="false"/>
+          <w:sz w:val="22"/>
+          <w:szCs w:val="22"/>
+        </w:rPr>
+        <w:t xml:space="preserve">.</w:t>
+      </w:r>
+    </w:p>
+    <w:p>
+      <w:pPr>
+        <w:spacing w:after="100"/>
+        <w:ind w:left="300"/>
+      </w:pPr>
+      <w:r>
+        <w:rPr>
+          <w:b/>
+          <w:bCs/>
+          <w:color w:val="1F3864"/>
+          <w:sz w:val="22"/>
+          <w:szCs w:val="22"/>
+        </w:rPr>
+        <w:t xml:space="preserve">• </w:t>
+      </w:r>
+      <w:r>
+        <w:rPr>
+          <w:b/>
+          <w:bCs/>
+          <w:i w:val="false"/>
+          <w:iCs w:val="false"/>
+          <w:sz w:val="22"/>
+          <w:szCs w:val="22"/>
+        </w:rPr>
+        <w:t xml:space="preserve">Alternativa descartada:</w:t>
+      </w:r>
+      <w:r>
+        <w:rPr>
+          <w:b w:val="false"/>
+          <w:bCs w:val="false"/>
+          <w:i w:val="false"/>
+          <w:iCs w:val="false"/>
+          <w:sz w:val="22"/>
+          <w:szCs w:val="22"/>
+        </w:rPr>
+        <w:t xml:space="preserve"> ajustar curvas de declinación tipo Arps pozo por pozo. Es más fiel físicamente, pero costoso de ajustar y de explicar en el tiempo disponible; queda como mejora futura.</w:t>
+      </w:r>
+    </w:p>
+    <w:p>
+      <w:pPr>
+        <w:spacing w:after="160"/>
+      </w:pPr>
+    </w:p>
+    <w:p>
+      <w:pPr>
+        <w:pStyle w:val="Heading2"/>
+        <w:spacing w:after="140" w:before="280"/>
+      </w:pPr>
+      <w:r>
+        <w:rPr>
+          <w:b/>
+          <w:bCs/>
+          <w:i w:val="false"/>
+          <w:iCs w:val="false"/>
+          <w:color w:val="2E5395"/>
+          <w:sz w:val="24"/>
+          <w:szCs w:val="24"/>
+        </w:rPr>
+        <w:t xml:space="preserve">11.2 Primera versión: resultado engañoso (descartado)</w:t>
+      </w:r>
+    </w:p>
+    <w:p>
+      <w:pPr>
+        <w:spacing w:after="160"/>
+        <w:jc w:val="both"/>
+      </w:pPr>
+      <w:r>
+        <w:rPr>
+          <w:b w:val="false"/>
+          <w:bCs w:val="false"/>
+          <w:i w:val="false"/>
+          <w:iCs w:val="false"/>
+          <w:sz w:val="22"/>
+          <w:szCs w:val="22"/>
+        </w:rPr>
+        <w:t xml:space="preserve">La primera corrida resumió cada pozo con el </w:t>
+      </w:r>
+      <w:r>
+        <w:rPr>
+          <w:b/>
+          <w:bCs/>
+          <w:i w:val="false"/>
+          <w:iCs w:val="false"/>
+          <w:sz w:val="22"/>
+          <w:szCs w:val="22"/>
+        </w:rPr>
+        <w:t xml:space="preserve">promedio</w:t>
+      </w:r>
+      <w:r>
+        <w:rPr>
+          <w:b w:val="false"/>
+          <w:bCs w:val="false"/>
+          <w:i w:val="false"/>
+          <w:iCs w:val="false"/>
+          <w:sz w:val="22"/>
+          <w:szCs w:val="22"/>
+        </w:rPr>
+        <w:t xml:space="preserve"> de la declinación y del ratio gas/petróleo (4.343 pozos tras el </w:t>
+      </w:r>
+      <w:r>
+        <w:rPr>
+          <w:rFonts w:ascii="Consolas" w:cs="Consolas" w:eastAsia="Consolas" w:hAnsi="Consolas"/>
+          <w:b w:val="false"/>
+          <w:bCs w:val="false"/>
+          <w:color w:val="C0392B"/>
+          <w:sz w:val="20"/>
+          <w:szCs w:val="20"/>
+          <w:shd w:fill="F0F0F0" w:val="clear"/>
+        </w:rPr>
+        <w:t xml:space="preserve">dropna()</w:t>
+      </w:r>
+      <w:r>
+        <w:rPr>
+          <w:b w:val="false"/>
+          <w:bCs w:val="false"/>
+          <w:i w:val="false"/>
+          <w:iCs w:val="false"/>
+          <w:sz w:val="22"/>
+          <w:szCs w:val="22"/>
+        </w:rPr>
+        <w:t xml:space="preserve">). Con k = 4, </w:t>
+      </w:r>
+      <w:r>
+        <w:rPr>
+          <w:b/>
+          <w:bCs/>
+          <w:i w:val="false"/>
+          <w:iCs w:val="false"/>
+          <w:sz w:val="22"/>
+          <w:szCs w:val="22"/>
+        </w:rPr>
+        <w:t xml:space="preserve">dos de los cuatro clusters tenían un solo pozo</w:t>
+      </w:r>
+      <w:r>
+        <w:rPr>
+          <w:b w:val="false"/>
+          <w:bCs w:val="false"/>
+          <w:i w:val="false"/>
+          <w:iCs w:val="false"/>
+          <w:sz w:val="22"/>
+          <w:szCs w:val="22"/>
+        </w:rPr>
+        <w:t xml:space="preserve">: el pozo 162450 (pico de 0,005 y ratio gas/petróleo de 1.339.944, por dividir por una producción casi nula) y el pozo 137343 (declinación promedio de 839.563). El silhouette de 0,542 estaba inflado por esos dos puntos aislados y el PCA mostraba los 4.341 pozos restantes aplastados en una línea.</w:t>
+      </w:r>
+    </w:p>
+    <w:p>
+      <w:pPr>
+        <w:spacing w:after="160"/>
+        <w:jc w:val="both"/>
+      </w:pPr>
+      <w:r>
+        <w:rPr>
+          <w:b/>
+          <w:bCs/>
+          <w:i w:val="false"/>
+          <w:iCs w:val="false"/>
+          <w:sz w:val="22"/>
+          <w:szCs w:val="22"/>
+        </w:rPr>
+        <w:t xml:space="preserve">Diagnóstico:</w:t>
+      </w:r>
+      <w:r>
+        <w:rPr>
+          <w:b w:val="false"/>
+          <w:bCs w:val="false"/>
+          <w:i w:val="false"/>
+          <w:iCs w:val="false"/>
+          <w:sz w:val="22"/>
+          <w:szCs w:val="22"/>
+        </w:rPr>
+        <w:t xml:space="preserve"> la declinación y el ratio son cocientes que se disparan cuando el denominador está cerca de cero, y unos pocos valores extremos distorsionaban el promedio y el escalado. En lugar de cerrar el notebook con un k que "daba bien" en las métricas, se corrigió el origen del problema.</w:t>
+      </w:r>
+    </w:p>
+    <w:p>
+      <w:pPr>
+        <w:pStyle w:val="Heading2"/>
+        <w:spacing w:after="140" w:before="280"/>
+      </w:pPr>
+      <w:r>
+        <w:rPr>
+          <w:b/>
+          <w:bCs/>
+          <w:i w:val="false"/>
+          <w:iCs w:val="false"/>
+          <w:color w:val="2E5395"/>
+          <w:sz w:val="24"/>
+          <w:szCs w:val="24"/>
+        </w:rPr>
+        <w:t xml:space="preserve">11.3 Correcciones aplicadas</w:t>
+      </w:r>
+    </w:p>
+    <w:tbl>
+      <w:tblPr>
+        <w:tblW w:type="dxa" w:w="9350"/>
+        <w:tblBorders>
+          <w:top w:val="single" w:color="B0B0B0" w:sz="2"/>
+          <w:left w:val="single" w:color="B0B0B0" w:sz="2"/>
+          <w:bottom w:val="single" w:color="B0B0B0" w:sz="2"/>
+          <w:right w:val="single" w:color="B0B0B0" w:sz="2"/>
+          <w:insideH w:val="single" w:color="D9D9D9" w:sz="2"/>
+          <w:insideV w:val="single" w:color="D9D9D9" w:sz="2"/>
+        </w:tblBorders>
+      </w:tblPr>
+      <w:tblGrid>
+        <w:gridCol w:w="4675"/>
+        <w:gridCol w:w="4675"/>
+      </w:tblGrid>
+      <w:tr>
+        <w:trPr>
+          <w:tblHeader/>
+        </w:trPr>
+        <w:tc>
+          <w:tcPr>
+            <w:tcW w:type="dxa" w:w="4675"/>
+            <w:shd w:fill="1F3864" w:val="clear"/>
+            <w:tcMar>
+              <w:top w:type="dxa" w:w="80"/>
+              <w:left w:type="dxa" w:w="120"/>
+              <w:bottom w:type="dxa" w:w="80"/>
+              <w:right w:type="dxa" w:w="120"/>
+            </w:tcMar>
+            <w:vAlign w:val="center"/>
+          </w:tcPr>
+          <w:p>
+            <w:r>
+              <w:rPr>
+                <w:b/>
+                <w:bCs/>
+                <w:i w:val="false"/>
+                <w:iCs w:val="false"/>
+                <w:color w:val="FFFFFF"/>
+                <w:sz w:val="20"/>
+                <w:szCs w:val="20"/>
+              </w:rPr>
+              <w:t xml:space="preserve">Problema</w:t>
+            </w:r>
+          </w:p>
+        </w:tc>
+        <w:tc>
+          <w:tcPr>
+            <w:tcW w:type="dxa" w:w="4675"/>
+            <w:shd w:fill="1F3864" w:val="clear"/>
+            <w:tcMar>
+              <w:top w:type="dxa" w:w="80"/>
+              <w:left w:type="dxa" w:w="120"/>
+              <w:bottom w:type="dxa" w:w="80"/>
+              <w:right w:type="dxa" w:w="120"/>
+            </w:tcMar>
+            <w:vAlign w:val="center"/>
+          </w:tcPr>
+          <w:p>
+            <w:r>
+              <w:rPr>
+                <w:b/>
+                <w:bCs/>
+                <w:i w:val="false"/>
+                <w:iCs w:val="false"/>
+                <w:color w:val="FFFFFF"/>
+                <w:sz w:val="20"/>
+                <w:szCs w:val="20"/>
+              </w:rPr>
+              <w:t xml:space="preserve">Corrección</w:t>
+            </w:r>
+          </w:p>
+        </w:tc>
+      </w:tr>
+      <w:tr>
+        <w:tc>
+          <w:tcPr>
+            <w:tcW w:type="dxa" w:w="4675"/>
+            <w:tcMar>
+              <w:top w:type="dxa" w:w="80"/>
+              <w:left w:type="dxa" w:w="120"/>
+              <w:bottom w:type="dxa" w:w="80"/>
+              <w:right w:type="dxa" w:w="120"/>
+            </w:tcMar>
+            <w:vAlign w:val="center"/>
+          </w:tcPr>
+          <w:p>
+            <w:r>
+              <w:rPr>
+                <w:b w:val="false"/>
+                <w:bCs w:val="false"/>
+                <w:i w:val="false"/>
+                <w:iCs w:val="false"/>
+                <w:sz w:val="20"/>
+                <w:szCs w:val="20"/>
+              </w:rPr>
+              <w:t xml:space="preserve">48 pozos con pico menor a 1 (casi sin petróleo) generan ratios absurdos</w:t>
+            </w:r>
+          </w:p>
+        </w:tc>
+        <w:tc>
+          <w:tcPr>
+            <w:tcW w:type="dxa" w:w="4675"/>
+            <w:tcMar>
+              <w:top w:type="dxa" w:w="80"/>
+              <w:left w:type="dxa" w:w="120"/>
+              <w:bottom w:type="dxa" w:w="80"/>
+              <w:right w:type="dxa" w:w="120"/>
+            </w:tcMar>
+            <w:vAlign w:val="center"/>
+          </w:tcPr>
+          <w:p>
+            <w:r>
+              <w:rPr>
+                <w:b w:val="false"/>
+                <w:bCs w:val="false"/>
+                <w:i w:val="false"/>
+                <w:iCs w:val="false"/>
+                <w:sz w:val="20"/>
+                <w:szCs w:val="20"/>
+              </w:rPr>
+              <w:t xml:space="preserve">Se filtran los pozos con </w:t>
+            </w:r>
+            <w:r>
+              <w:rPr>
+                <w:rFonts w:ascii="Consolas" w:cs="Consolas" w:eastAsia="Consolas" w:hAnsi="Consolas"/>
+                <w:b w:val="false"/>
+                <w:bCs w:val="false"/>
+                <w:color w:val="C0392B"/>
+                <w:sz w:val="20"/>
+                <w:szCs w:val="20"/>
+                <w:shd w:fill="F0F0F0" w:val="clear"/>
+              </w:rPr>
+              <w:t xml:space="preserve">pico_prod_pet</w:t>
+            </w:r>
+            <w:r>
+              <w:rPr>
+                <w:b w:val="false"/>
+                <w:bCs w:val="false"/>
+                <w:i w:val="false"/>
+                <w:iCs w:val="false"/>
+                <w:sz w:val="20"/>
+                <w:szCs w:val="20"/>
+              </w:rPr>
+              <w:t xml:space="preserve"> menor a 1 (4.343 → </w:t>
+            </w:r>
+            <w:r>
+              <w:rPr>
+                <w:b/>
+                <w:bCs/>
+                <w:i w:val="false"/>
+                <w:iCs w:val="false"/>
+                <w:sz w:val="20"/>
+                <w:szCs w:val="20"/>
+              </w:rPr>
+              <w:t xml:space="preserve">4.295</w:t>
+            </w:r>
+            <w:r>
+              <w:rPr>
+                <w:b w:val="false"/>
+                <w:bCs w:val="false"/>
+                <w:i w:val="false"/>
+                <w:iCs w:val="false"/>
+                <w:sz w:val="20"/>
+                <w:szCs w:val="20"/>
+              </w:rPr>
+              <w:t xml:space="preserve"> pozos)</w:t>
+            </w:r>
+          </w:p>
+        </w:tc>
+      </w:tr>
+      <w:tr>
+        <w:tc>
+          <w:tcPr>
+            <w:tcW w:type="dxa" w:w="4675"/>
+            <w:tcMar>
+              <w:top w:type="dxa" w:w="80"/>
+              <w:left w:type="dxa" w:w="120"/>
+              <w:bottom w:type="dxa" w:w="80"/>
+              <w:right w:type="dxa" w:w="120"/>
+            </w:tcMar>
+            <w:vAlign w:val="center"/>
+          </w:tcPr>
+          <w:p>
+            <w:r>
+              <w:rPr>
+                <w:b w:val="false"/>
+                <w:bCs w:val="false"/>
+                <w:i w:val="false"/>
+                <w:iCs w:val="false"/>
+                <w:sz w:val="20"/>
+                <w:szCs w:val="20"/>
+              </w:rPr>
+              <w:t xml:space="preserve">El promedio es muy sensible a valores extremos</w:t>
+            </w:r>
+          </w:p>
+        </w:tc>
+        <w:tc>
+          <w:tcPr>
+            <w:tcW w:type="dxa" w:w="4675"/>
+            <w:tcMar>
+              <w:top w:type="dxa" w:w="80"/>
+              <w:left w:type="dxa" w:w="120"/>
+              <w:bottom w:type="dxa" w:w="80"/>
+              <w:right w:type="dxa" w:w="120"/>
+            </w:tcMar>
+            <w:vAlign w:val="center"/>
+          </w:tcPr>
+          <w:p>
+            <w:r>
+              <w:rPr>
+                <w:b w:val="false"/>
+                <w:bCs w:val="false"/>
+                <w:i w:val="false"/>
+                <w:iCs w:val="false"/>
+                <w:sz w:val="20"/>
+                <w:szCs w:val="20"/>
+              </w:rPr>
+              <w:t xml:space="preserve">Se usa la </w:t>
+            </w:r>
+            <w:r>
+              <w:rPr>
+                <w:b/>
+                <w:bCs/>
+                <w:i w:val="false"/>
+                <w:iCs w:val="false"/>
+                <w:sz w:val="20"/>
+                <w:szCs w:val="20"/>
+              </w:rPr>
+              <w:t xml:space="preserve">mediana</w:t>
+            </w:r>
+            <w:r>
+              <w:rPr>
+                <w:b w:val="false"/>
+                <w:bCs w:val="false"/>
+                <w:i w:val="false"/>
+                <w:iCs w:val="false"/>
+                <w:sz w:val="20"/>
+                <w:szCs w:val="20"/>
+              </w:rPr>
+              <w:t xml:space="preserve"> en </w:t>
+            </w:r>
+            <w:r>
+              <w:rPr>
+                <w:rFonts w:ascii="Consolas" w:cs="Consolas" w:eastAsia="Consolas" w:hAnsi="Consolas"/>
+                <w:b w:val="false"/>
+                <w:bCs w:val="false"/>
+                <w:color w:val="C0392B"/>
+                <w:sz w:val="20"/>
+                <w:szCs w:val="20"/>
+                <w:shd w:fill="F0F0F0" w:val="clear"/>
+              </w:rPr>
+              <w:t xml:space="preserve">declinacion_promedio</w:t>
+            </w:r>
+            <w:r>
+              <w:rPr>
+                <w:b w:val="false"/>
+                <w:bCs w:val="false"/>
+                <w:i w:val="false"/>
+                <w:iCs w:val="false"/>
+                <w:sz w:val="20"/>
+                <w:szCs w:val="20"/>
+              </w:rPr>
+              <w:t xml:space="preserve"> y </w:t>
+            </w:r>
+            <w:r>
+              <w:rPr>
+                <w:rFonts w:ascii="Consolas" w:cs="Consolas" w:eastAsia="Consolas" w:hAnsi="Consolas"/>
+                <w:b w:val="false"/>
+                <w:bCs w:val="false"/>
+                <w:color w:val="C0392B"/>
+                <w:sz w:val="20"/>
+                <w:szCs w:val="20"/>
+                <w:shd w:fill="F0F0F0" w:val="clear"/>
+              </w:rPr>
+              <w:t xml:space="preserve">ratio_gas_pet_promedio</w:t>
+            </w:r>
+          </w:p>
+        </w:tc>
+      </w:tr>
+      <w:tr>
+        <w:tc>
+          <w:tcPr>
+            <w:tcW w:type="dxa" w:w="4675"/>
+            <w:tcMar>
+              <w:top w:type="dxa" w:w="80"/>
+              <w:left w:type="dxa" w:w="120"/>
+              <w:bottom w:type="dxa" w:w="80"/>
+              <w:right w:type="dxa" w:w="120"/>
+            </w:tcMar>
+            <w:vAlign w:val="center"/>
+          </w:tcPr>
+          <w:p>
+            <w:r>
+              <w:rPr>
+                <w:b w:val="false"/>
+                <w:bCs w:val="false"/>
+                <w:i w:val="false"/>
+                <w:iCs w:val="false"/>
+                <w:sz w:val="20"/>
+                <w:szCs w:val="20"/>
+              </w:rPr>
+              <w:t xml:space="preserve">La declinación no tiene techo (piso natural en -1: la producción cae a cero)</w:t>
+            </w:r>
+          </w:p>
+        </w:tc>
+        <w:tc>
+          <w:tcPr>
+            <w:tcW w:type="dxa" w:w="4675"/>
+            <w:tcMar>
+              <w:top w:type="dxa" w:w="80"/>
+              <w:left w:type="dxa" w:w="120"/>
+              <w:bottom w:type="dxa" w:w="80"/>
+              <w:right w:type="dxa" w:w="120"/>
+            </w:tcMar>
+            <w:vAlign w:val="center"/>
+          </w:tcPr>
+          <w:p>
+            <w:r>
+              <w:rPr>
+                <w:b w:val="false"/>
+                <w:bCs w:val="false"/>
+                <w:i w:val="false"/>
+                <w:iCs w:val="false"/>
+                <w:sz w:val="20"/>
+                <w:szCs w:val="20"/>
+              </w:rPr>
+              <w:t xml:space="preserve">Se recorta entre -1 y el percentil 99 (≈ 4,46)</w:t>
+            </w:r>
+          </w:p>
+        </w:tc>
+      </w:tr>
+      <w:tr>
+        <w:tc>
+          <w:tcPr>
+            <w:tcW w:type="dxa" w:w="4675"/>
+            <w:tcMar>
+              <w:top w:type="dxa" w:w="80"/>
+              <w:left w:type="dxa" w:w="120"/>
+              <w:bottom w:type="dxa" w:w="80"/>
+              <w:right w:type="dxa" w:w="120"/>
+            </w:tcMar>
+            <w:vAlign w:val="center"/>
+          </w:tcPr>
+          <w:p>
+            <w:r>
+              <w:rPr>
+                <w:rFonts w:ascii="Consolas" w:cs="Consolas" w:eastAsia="Consolas" w:hAnsi="Consolas"/>
+                <w:b w:val="false"/>
+                <w:bCs w:val="false"/>
+                <w:color w:val="C0392B"/>
+                <w:sz w:val="20"/>
+                <w:szCs w:val="20"/>
+                <w:shd w:fill="F0F0F0" w:val="clear"/>
+              </w:rPr>
+              <w:t xml:space="preserve">pico_prod_pet</w:t>
+            </w:r>
+            <w:r>
+              <w:rPr>
+                <w:b w:val="false"/>
+                <w:bCs w:val="false"/>
+                <w:i w:val="false"/>
+                <w:iCs w:val="false"/>
+                <w:sz w:val="20"/>
+                <w:szCs w:val="20"/>
+              </w:rPr>
+              <w:t xml:space="preserve"> y el ratio tienen cola muy larga</w:t>
+            </w:r>
+          </w:p>
+        </w:tc>
+        <w:tc>
+          <w:tcPr>
+            <w:tcW w:type="dxa" w:w="4675"/>
+            <w:tcMar>
+              <w:top w:type="dxa" w:w="80"/>
+              <w:left w:type="dxa" w:w="120"/>
+              <w:bottom w:type="dxa" w:w="80"/>
+              <w:right w:type="dxa" w:w="120"/>
+            </w:tcMar>
+            <w:vAlign w:val="center"/>
+          </w:tcPr>
+          <w:p>
+            <w:r>
+              <w:rPr>
+                <w:b w:val="false"/>
+                <w:bCs w:val="false"/>
+                <w:i w:val="false"/>
+                <w:iCs w:val="false"/>
+                <w:sz w:val="20"/>
+                <w:szCs w:val="20"/>
+              </w:rPr>
+              <w:t xml:space="preserve">Se aplica </w:t>
+            </w:r>
+            <w:r>
+              <w:rPr>
+                <w:rFonts w:ascii="Consolas" w:cs="Consolas" w:eastAsia="Consolas" w:hAnsi="Consolas"/>
+                <w:b w:val="false"/>
+                <w:bCs w:val="false"/>
+                <w:color w:val="C0392B"/>
+                <w:sz w:val="20"/>
+                <w:szCs w:val="20"/>
+                <w:shd w:fill="F0F0F0" w:val="clear"/>
+              </w:rPr>
+              <w:t xml:space="preserve">np.log1p</w:t>
+            </w:r>
+            <w:r>
+              <w:rPr>
+                <w:b w:val="false"/>
+                <w:bCs w:val="false"/>
+                <w:i w:val="false"/>
+                <w:iCs w:val="false"/>
+                <w:sz w:val="20"/>
+                <w:szCs w:val="20"/>
+              </w:rPr>
+              <w:t xml:space="preserve"> a ambas</w:t>
+            </w:r>
+          </w:p>
+        </w:tc>
+      </w:tr>
+      <w:tr>
+        <w:tc>
+          <w:tcPr>
+            <w:tcW w:type="dxa" w:w="4675"/>
+            <w:tcMar>
+              <w:top w:type="dxa" w:w="80"/>
+              <w:left w:type="dxa" w:w="120"/>
+              <w:bottom w:type="dxa" w:w="80"/>
+              <w:right w:type="dxa" w:w="120"/>
+            </w:tcMar>
+            <w:vAlign w:val="center"/>
+          </w:tcPr>
+          <w:p>
+            <w:r>
+              <w:rPr>
+                <w:b w:val="false"/>
+                <w:bCs w:val="false"/>
+                <w:i w:val="false"/>
+                <w:iCs w:val="false"/>
+                <w:sz w:val="20"/>
+                <w:szCs w:val="20"/>
+              </w:rPr>
+              <w:t xml:space="preserve">Las variables están en escalas distintas</w:t>
+            </w:r>
+          </w:p>
+        </w:tc>
+        <w:tc>
+          <w:tcPr>
+            <w:tcW w:type="dxa" w:w="4675"/>
+            <w:tcMar>
+              <w:top w:type="dxa" w:w="80"/>
+              <w:left w:type="dxa" w:w="120"/>
+              <w:bottom w:type="dxa" w:w="80"/>
+              <w:right w:type="dxa" w:w="120"/>
+            </w:tcMar>
+            <w:vAlign w:val="center"/>
+          </w:tcPr>
+          <w:p>
+            <w:r>
+              <w:rPr>
+                <w:rFonts w:ascii="Consolas" w:cs="Consolas" w:eastAsia="Consolas" w:hAnsi="Consolas"/>
+                <w:b w:val="false"/>
+                <w:bCs w:val="false"/>
+                <w:color w:val="C0392B"/>
+                <w:sz w:val="20"/>
+                <w:szCs w:val="20"/>
+                <w:shd w:fill="F0F0F0" w:val="clear"/>
+              </w:rPr>
+              <w:t xml:space="preserve">StandardScaler</w:t>
+            </w:r>
+            <w:r>
+              <w:rPr>
+                <w:b w:val="false"/>
+                <w:bCs w:val="false"/>
+                <w:i w:val="false"/>
+                <w:iCs w:val="false"/>
+                <w:sz w:val="20"/>
+                <w:szCs w:val="20"/>
+              </w:rPr>
+              <w:t xml:space="preserve"> (media 0, desvío 1)</w:t>
+            </w:r>
+          </w:p>
+        </w:tc>
+      </w:tr>
+    </w:tbl>
+    <w:p>
+      <w:pPr>
+        <w:spacing w:after="160"/>
+      </w:pPr>
+    </w:p>
+    <w:p>
+      <w:pPr>
+        <w:spacing w:after="160"/>
+        <w:jc w:val="both"/>
+      </w:pPr>
+      <w:r>
+        <w:rPr>
+          <w:b/>
+          <w:bCs/>
+          <w:i w:val="false"/>
+          <w:iCs w:val="false"/>
+          <w:sz w:val="22"/>
+          <w:szCs w:val="22"/>
+        </w:rPr>
+        <w:t xml:space="preserve">Cobertura del clustering:</w:t>
+      </w:r>
+      <w:r>
+        <w:rPr>
+          <w:b w:val="false"/>
+          <w:bCs w:val="false"/>
+          <w:i w:val="false"/>
+          <w:iCs w:val="false"/>
+          <w:sz w:val="22"/>
+          <w:szCs w:val="22"/>
+        </w:rPr>
+        <w:t xml:space="preserve"> el dataset tiene 5.089 pozos únicos y el clustering usa 4.295. Quedaron afuera 508 pozos que nunca produjeron petróleo (gasíferos puros, su ratio gas/petróleo no está definido) y pozos con muy poca historia o producción casi nula. Es una decisión de diseño: se agrupan pozos con producción real de petróleo.</w:t>
+      </w:r>
+    </w:p>
+    <w:p>
+      <w:pPr>
+        <w:pStyle w:val="Heading2"/>
+        <w:spacing w:after="140" w:before="280"/>
+      </w:pPr>
+      <w:r>
+        <w:rPr>
+          <w:b/>
+          <w:bCs/>
+          <w:i w:val="false"/>
+          <w:iCs w:val="false"/>
+          <w:color w:val="2E5395"/>
+          <w:sz w:val="24"/>
+          <w:szCs w:val="24"/>
+        </w:rPr>
+        <w:t xml:space="preserve">11.4 Elección de k</w:t>
+      </w:r>
+    </w:p>
+    <w:tbl>
+      <w:tblPr>
+        <w:tblW w:type="dxa" w:w="9350"/>
+        <w:tblBorders>
+          <w:top w:val="single" w:color="B0B0B0" w:sz="2"/>
+          <w:left w:val="single" w:color="B0B0B0" w:sz="2"/>
+          <w:bottom w:val="single" w:color="B0B0B0" w:sz="2"/>
+          <w:right w:val="single" w:color="B0B0B0" w:sz="2"/>
+          <w:insideH w:val="single" w:color="D9D9D9" w:sz="2"/>
+          <w:insideV w:val="single" w:color="D9D9D9" w:sz="2"/>
+        </w:tblBorders>
+      </w:tblPr>
+      <w:tblGrid>
+        <w:gridCol w:w="3116"/>
+        <w:gridCol w:w="3117"/>
+        <w:gridCol w:w="3117"/>
+      </w:tblGrid>
+      <w:tr>
+        <w:trPr>
+          <w:tblHeader/>
+        </w:trPr>
+        <w:tc>
+          <w:tcPr>
+            <w:tcW w:type="dxa" w:w="3116"/>
+            <w:shd w:fill="1F3864" w:val="clear"/>
+            <w:tcMar>
+              <w:top w:type="dxa" w:w="80"/>
+              <w:left w:type="dxa" w:w="120"/>
+              <w:bottom w:type="dxa" w:w="80"/>
+              <w:right w:type="dxa" w:w="120"/>
+            </w:tcMar>
+            <w:vAlign w:val="center"/>
+          </w:tcPr>
+          <w:p>
+            <w:r>
+              <w:rPr>
+                <w:b/>
+                <w:bCs/>
+                <w:i w:val="false"/>
+                <w:iCs w:val="false"/>
+                <w:color w:val="FFFFFF"/>
+                <w:sz w:val="20"/>
+                <w:szCs w:val="20"/>
+              </w:rPr>
+              <w:t xml:space="preserve">k</w:t>
+            </w:r>
+          </w:p>
+        </w:tc>
+        <w:tc>
+          <w:tcPr>
+            <w:tcW w:type="dxa" w:w="3117"/>
+            <w:shd w:fill="1F3864" w:val="clear"/>
+            <w:tcMar>
+              <w:top w:type="dxa" w:w="80"/>
+              <w:left w:type="dxa" w:w="120"/>
+              <w:bottom w:type="dxa" w:w="80"/>
+              <w:right w:type="dxa" w:w="120"/>
+            </w:tcMar>
+            <w:vAlign w:val="center"/>
+          </w:tcPr>
+          <w:p>
+            <w:r>
+              <w:rPr>
+                <w:b/>
+                <w:bCs/>
+                <w:i w:val="false"/>
+                <w:iCs w:val="false"/>
+                <w:color w:val="FFFFFF"/>
+                <w:sz w:val="20"/>
+                <w:szCs w:val="20"/>
+              </w:rPr>
+              <w:t xml:space="preserve">Inercia</w:t>
+            </w:r>
+          </w:p>
+        </w:tc>
+        <w:tc>
+          <w:tcPr>
+            <w:tcW w:type="dxa" w:w="3117"/>
+            <w:shd w:fill="1F3864" w:val="clear"/>
+            <w:tcMar>
+              <w:top w:type="dxa" w:w="80"/>
+              <w:left w:type="dxa" w:w="120"/>
+              <w:bottom w:type="dxa" w:w="80"/>
+              <w:right w:type="dxa" w:w="120"/>
+            </w:tcMar>
+            <w:vAlign w:val="center"/>
+          </w:tcPr>
+          <w:p>
+            <w:r>
+              <w:rPr>
+                <w:b/>
+                <w:bCs/>
+                <w:i w:val="false"/>
+                <w:iCs w:val="false"/>
+                <w:color w:val="FFFFFF"/>
+                <w:sz w:val="20"/>
+                <w:szCs w:val="20"/>
+              </w:rPr>
+              <w:t xml:space="preserve">Silhouette</w:t>
+            </w:r>
+          </w:p>
+        </w:tc>
+      </w:tr>
+      <w:tr>
+        <w:tc>
+          <w:tcPr>
+            <w:tcW w:type="dxa" w:w="3116"/>
+            <w:tcMar>
+              <w:top w:type="dxa" w:w="80"/>
+              <w:left w:type="dxa" w:w="120"/>
+              <w:bottom w:type="dxa" w:w="80"/>
+              <w:right w:type="dxa" w:w="120"/>
+            </w:tcMar>
+            <w:vAlign w:val="center"/>
+          </w:tcPr>
+          <w:p>
+            <w:r>
+              <w:rPr>
+                <w:b w:val="false"/>
+                <w:bCs w:val="false"/>
+                <w:i w:val="false"/>
+                <w:iCs w:val="false"/>
+                <w:sz w:val="20"/>
+                <w:szCs w:val="20"/>
+              </w:rPr>
+              <w:t xml:space="preserve">2</w:t>
+            </w:r>
+          </w:p>
+        </w:tc>
+        <w:tc>
+          <w:tcPr>
+            <w:tcW w:type="dxa" w:w="3117"/>
+            <w:tcMar>
+              <w:top w:type="dxa" w:w="80"/>
+              <w:left w:type="dxa" w:w="120"/>
+              <w:bottom w:type="dxa" w:w="80"/>
+              <w:right w:type="dxa" w:w="120"/>
+            </w:tcMar>
+            <w:vAlign w:val="center"/>
+          </w:tcPr>
+          <w:p>
+            <w:r>
+              <w:rPr>
+                <w:b w:val="false"/>
+                <w:bCs w:val="false"/>
+                <w:i w:val="false"/>
+                <w:iCs w:val="false"/>
+                <w:sz w:val="20"/>
+                <w:szCs w:val="20"/>
+              </w:rPr>
+              <w:t xml:space="preserve">10.340</w:t>
+            </w:r>
+          </w:p>
+        </w:tc>
+        <w:tc>
+          <w:tcPr>
+            <w:tcW w:type="dxa" w:w="3117"/>
+            <w:tcMar>
+              <w:top w:type="dxa" w:w="80"/>
+              <w:left w:type="dxa" w:w="120"/>
+              <w:bottom w:type="dxa" w:w="80"/>
+              <w:right w:type="dxa" w:w="120"/>
+            </w:tcMar>
+            <w:vAlign w:val="center"/>
+          </w:tcPr>
+          <w:p>
+            <w:r>
+              <w:rPr>
+                <w:b w:val="false"/>
+                <w:bCs w:val="false"/>
+                <w:i w:val="false"/>
+                <w:iCs w:val="false"/>
+                <w:sz w:val="20"/>
+                <w:szCs w:val="20"/>
+              </w:rPr>
+              <w:t xml:space="preserve">0,440</w:t>
+            </w:r>
+          </w:p>
+        </w:tc>
+      </w:tr>
+      <w:tr>
+        <w:tc>
+          <w:tcPr>
+            <w:tcW w:type="dxa" w:w="3116"/>
+            <w:tcMar>
+              <w:top w:type="dxa" w:w="80"/>
+              <w:left w:type="dxa" w:w="120"/>
+              <w:bottom w:type="dxa" w:w="80"/>
+              <w:right w:type="dxa" w:w="120"/>
+            </w:tcMar>
+            <w:vAlign w:val="center"/>
+          </w:tcPr>
+          <w:p>
+            <w:r>
+              <w:rPr>
+                <w:b w:val="false"/>
+                <w:bCs w:val="false"/>
+                <w:i w:val="false"/>
+                <w:iCs w:val="false"/>
+                <w:sz w:val="20"/>
+                <w:szCs w:val="20"/>
+              </w:rPr>
+              <w:t xml:space="preserve">3</w:t>
+            </w:r>
+          </w:p>
+        </w:tc>
+        <w:tc>
+          <w:tcPr>
+            <w:tcW w:type="dxa" w:w="3117"/>
+            <w:tcMar>
+              <w:top w:type="dxa" w:w="80"/>
+              <w:left w:type="dxa" w:w="120"/>
+              <w:bottom w:type="dxa" w:w="80"/>
+              <w:right w:type="dxa" w:w="120"/>
+            </w:tcMar>
+            <w:vAlign w:val="center"/>
+          </w:tcPr>
+          <w:p>
+            <w:r>
+              <w:rPr>
+                <w:b w:val="false"/>
+                <w:bCs w:val="false"/>
+                <w:i w:val="false"/>
+                <w:iCs w:val="false"/>
+                <w:sz w:val="20"/>
+                <w:szCs w:val="20"/>
+              </w:rPr>
+              <w:t xml:space="preserve">6.826</w:t>
+            </w:r>
+          </w:p>
+        </w:tc>
+        <w:tc>
+          <w:tcPr>
+            <w:tcW w:type="dxa" w:w="3117"/>
+            <w:tcMar>
+              <w:top w:type="dxa" w:w="80"/>
+              <w:left w:type="dxa" w:w="120"/>
+              <w:bottom w:type="dxa" w:w="80"/>
+              <w:right w:type="dxa" w:w="120"/>
+            </w:tcMar>
+            <w:vAlign w:val="center"/>
+          </w:tcPr>
+          <w:p>
+            <w:r>
+              <w:rPr>
+                <w:b/>
+                <w:bCs/>
+                <w:i w:val="false"/>
+                <w:iCs w:val="false"/>
+                <w:sz w:val="20"/>
+                <w:szCs w:val="20"/>
+              </w:rPr>
+              <w:t xml:space="preserve">0,486</w:t>
+            </w:r>
+          </w:p>
+        </w:tc>
+      </w:tr>
+      <w:tr>
+        <w:tc>
+          <w:tcPr>
+            <w:tcW w:type="dxa" w:w="3116"/>
+            <w:tcMar>
+              <w:top w:type="dxa" w:w="80"/>
+              <w:left w:type="dxa" w:w="120"/>
+              <w:bottom w:type="dxa" w:w="80"/>
+              <w:right w:type="dxa" w:w="120"/>
+            </w:tcMar>
+            <w:vAlign w:val="center"/>
+          </w:tcPr>
+          <w:p>
+            <w:r>
+              <w:rPr>
+                <w:b/>
+                <w:bCs/>
+                <w:i w:val="false"/>
+                <w:iCs w:val="false"/>
+                <w:sz w:val="20"/>
+                <w:szCs w:val="20"/>
+              </w:rPr>
+              <w:t xml:space="preserve">4</w:t>
+            </w:r>
+          </w:p>
+        </w:tc>
+        <w:tc>
+          <w:tcPr>
+            <w:tcW w:type="dxa" w:w="3117"/>
+            <w:tcMar>
+              <w:top w:type="dxa" w:w="80"/>
+              <w:left w:type="dxa" w:w="120"/>
+              <w:bottom w:type="dxa" w:w="80"/>
+              <w:right w:type="dxa" w:w="120"/>
+            </w:tcMar>
+            <w:vAlign w:val="center"/>
+          </w:tcPr>
+          <w:p>
+            <w:r>
+              <w:rPr>
+                <w:b/>
+                <w:bCs/>
+                <w:i w:val="false"/>
+                <w:iCs w:val="false"/>
+                <w:sz w:val="20"/>
+                <w:szCs w:val="20"/>
+              </w:rPr>
+              <w:t xml:space="preserve">4.417</w:t>
+            </w:r>
+          </w:p>
+        </w:tc>
+        <w:tc>
+          <w:tcPr>
+            <w:tcW w:type="dxa" w:w="3117"/>
+            <w:tcMar>
+              <w:top w:type="dxa" w:w="80"/>
+              <w:left w:type="dxa" w:w="120"/>
+              <w:bottom w:type="dxa" w:w="80"/>
+              <w:right w:type="dxa" w:w="120"/>
+            </w:tcMar>
+            <w:vAlign w:val="center"/>
+          </w:tcPr>
+          <w:p>
+            <w:r>
+              <w:rPr>
+                <w:b/>
+                <w:bCs/>
+                <w:i w:val="false"/>
+                <w:iCs w:val="false"/>
+                <w:sz w:val="20"/>
+                <w:szCs w:val="20"/>
+              </w:rPr>
+              <w:t xml:space="preserve">0,473</w:t>
+            </w:r>
+          </w:p>
+        </w:tc>
+      </w:tr>
+      <w:tr>
+        <w:tc>
+          <w:tcPr>
+            <w:tcW w:type="dxa" w:w="3116"/>
+            <w:tcMar>
+              <w:top w:type="dxa" w:w="80"/>
+              <w:left w:type="dxa" w:w="120"/>
+              <w:bottom w:type="dxa" w:w="80"/>
+              <w:right w:type="dxa" w:w="120"/>
+            </w:tcMar>
+            <w:vAlign w:val="center"/>
+          </w:tcPr>
+          <w:p>
+            <w:r>
+              <w:rPr>
+                <w:b w:val="false"/>
+                <w:bCs w:val="false"/>
+                <w:i w:val="false"/>
+                <w:iCs w:val="false"/>
+                <w:sz w:val="20"/>
+                <w:szCs w:val="20"/>
+              </w:rPr>
+              <w:t xml:space="preserve">5</w:t>
+            </w:r>
+          </w:p>
+        </w:tc>
+        <w:tc>
+          <w:tcPr>
+            <w:tcW w:type="dxa" w:w="3117"/>
+            <w:tcMar>
+              <w:top w:type="dxa" w:w="80"/>
+              <w:left w:type="dxa" w:w="120"/>
+              <w:bottom w:type="dxa" w:w="80"/>
+              <w:right w:type="dxa" w:w="120"/>
+            </w:tcMar>
+            <w:vAlign w:val="center"/>
+          </w:tcPr>
+          <w:p>
+            <w:r>
+              <w:rPr>
+                <w:b w:val="false"/>
+                <w:bCs w:val="false"/>
+                <w:i w:val="false"/>
+                <w:iCs w:val="false"/>
+                <w:sz w:val="20"/>
+                <w:szCs w:val="20"/>
+              </w:rPr>
+              <w:t xml:space="preserve">3.791</w:t>
+            </w:r>
+          </w:p>
+        </w:tc>
+        <w:tc>
+          <w:tcPr>
+            <w:tcW w:type="dxa" w:w="3117"/>
+            <w:tcMar>
+              <w:top w:type="dxa" w:w="80"/>
+              <w:left w:type="dxa" w:w="120"/>
+              <w:bottom w:type="dxa" w:w="80"/>
+              <w:right w:type="dxa" w:w="120"/>
+            </w:tcMar>
+            <w:vAlign w:val="center"/>
+          </w:tcPr>
+          <w:p>
+            <w:r>
+              <w:rPr>
+                <w:b w:val="false"/>
+                <w:bCs w:val="false"/>
+                <w:i w:val="false"/>
+                <w:iCs w:val="false"/>
+                <w:sz w:val="20"/>
+                <w:szCs w:val="20"/>
+              </w:rPr>
+              <w:t xml:space="preserve">0,456</w:t>
+            </w:r>
+          </w:p>
+        </w:tc>
+      </w:tr>
+      <w:tr>
+        <w:tc>
+          <w:tcPr>
+            <w:tcW w:type="dxa" w:w="3116"/>
+            <w:tcMar>
+              <w:top w:type="dxa" w:w="80"/>
+              <w:left w:type="dxa" w:w="120"/>
+              <w:bottom w:type="dxa" w:w="80"/>
+              <w:right w:type="dxa" w:w="120"/>
+            </w:tcMar>
+            <w:vAlign w:val="center"/>
+          </w:tcPr>
+          <w:p>
+            <w:r>
+              <w:rPr>
+                <w:b w:val="false"/>
+                <w:bCs w:val="false"/>
+                <w:i w:val="false"/>
+                <w:iCs w:val="false"/>
+                <w:sz w:val="20"/>
+                <w:szCs w:val="20"/>
+              </w:rPr>
+              <w:t xml:space="preserve">6</w:t>
+            </w:r>
+          </w:p>
+        </w:tc>
+        <w:tc>
+          <w:tcPr>
+            <w:tcW w:type="dxa" w:w="3117"/>
+            <w:tcMar>
+              <w:top w:type="dxa" w:w="80"/>
+              <w:left w:type="dxa" w:w="120"/>
+              <w:bottom w:type="dxa" w:w="80"/>
+              <w:right w:type="dxa" w:w="120"/>
+            </w:tcMar>
+            <w:vAlign w:val="center"/>
+          </w:tcPr>
+          <w:p>
+            <w:r>
+              <w:rPr>
+                <w:b w:val="false"/>
+                <w:bCs w:val="false"/>
+                <w:i w:val="false"/>
+                <w:iCs w:val="false"/>
+                <w:sz w:val="20"/>
+                <w:szCs w:val="20"/>
+              </w:rPr>
+              <w:t xml:space="preserve">3.245</w:t>
+            </w:r>
+          </w:p>
+        </w:tc>
+        <w:tc>
+          <w:tcPr>
+            <w:tcW w:type="dxa" w:w="3117"/>
+            <w:tcMar>
+              <w:top w:type="dxa" w:w="80"/>
+              <w:left w:type="dxa" w:w="120"/>
+              <w:bottom w:type="dxa" w:w="80"/>
+              <w:right w:type="dxa" w:w="120"/>
+            </w:tcMar>
+            <w:vAlign w:val="center"/>
+          </w:tcPr>
+          <w:p>
+            <w:r>
+              <w:rPr>
+                <w:b w:val="false"/>
+                <w:bCs w:val="false"/>
+                <w:i w:val="false"/>
+                <w:iCs w:val="false"/>
+                <w:sz w:val="20"/>
+                <w:szCs w:val="20"/>
+              </w:rPr>
+              <w:t xml:space="preserve">0,457</w:t>
+            </w:r>
+          </w:p>
+        </w:tc>
+      </w:tr>
+      <w:tr>
+        <w:tc>
+          <w:tcPr>
+            <w:tcW w:type="dxa" w:w="3116"/>
+            <w:tcMar>
+              <w:top w:type="dxa" w:w="80"/>
+              <w:left w:type="dxa" w:w="120"/>
+              <w:bottom w:type="dxa" w:w="80"/>
+              <w:right w:type="dxa" w:w="120"/>
+            </w:tcMar>
+            <w:vAlign w:val="center"/>
+          </w:tcPr>
+          <w:p>
+            <w:r>
+              <w:rPr>
+                <w:b w:val="false"/>
+                <w:bCs w:val="false"/>
+                <w:i w:val="false"/>
+                <w:iCs w:val="false"/>
+                <w:sz w:val="20"/>
+                <w:szCs w:val="20"/>
+              </w:rPr>
+              <w:t xml:space="preserve">7</w:t>
+            </w:r>
+          </w:p>
+        </w:tc>
+        <w:tc>
+          <w:tcPr>
+            <w:tcW w:type="dxa" w:w="3117"/>
+            <w:tcMar>
+              <w:top w:type="dxa" w:w="80"/>
+              <w:left w:type="dxa" w:w="120"/>
+              <w:bottom w:type="dxa" w:w="80"/>
+              <w:right w:type="dxa" w:w="120"/>
+            </w:tcMar>
+            <w:vAlign w:val="center"/>
+          </w:tcPr>
+          <w:p>
+            <w:r>
+              <w:rPr>
+                <w:b w:val="false"/>
+                <w:bCs w:val="false"/>
+                <w:i w:val="false"/>
+                <w:iCs w:val="false"/>
+                <w:sz w:val="20"/>
+                <w:szCs w:val="20"/>
+              </w:rPr>
+              <w:t xml:space="preserve">2.898</w:t>
+            </w:r>
+          </w:p>
+        </w:tc>
+        <w:tc>
+          <w:tcPr>
+            <w:tcW w:type="dxa" w:w="3117"/>
+            <w:tcMar>
+              <w:top w:type="dxa" w:w="80"/>
+              <w:left w:type="dxa" w:w="120"/>
+              <w:bottom w:type="dxa" w:w="80"/>
+              <w:right w:type="dxa" w:w="120"/>
+            </w:tcMar>
+            <w:vAlign w:val="center"/>
+          </w:tcPr>
+          <w:p>
+            <w:r>
+              <w:rPr>
+                <w:b w:val="false"/>
+                <w:bCs w:val="false"/>
+                <w:i w:val="false"/>
+                <w:iCs w:val="false"/>
+                <w:sz w:val="20"/>
+                <w:szCs w:val="20"/>
+              </w:rPr>
+              <w:t xml:space="preserve">0,441</w:t>
+            </w:r>
+          </w:p>
+        </w:tc>
+      </w:tr>
+      <w:tr>
+        <w:tc>
+          <w:tcPr>
+            <w:tcW w:type="dxa" w:w="3116"/>
+            <w:tcMar>
+              <w:top w:type="dxa" w:w="80"/>
+              <w:left w:type="dxa" w:w="120"/>
+              <w:bottom w:type="dxa" w:w="80"/>
+              <w:right w:type="dxa" w:w="120"/>
+            </w:tcMar>
+            <w:vAlign w:val="center"/>
+          </w:tcPr>
+          <w:p>
+            <w:r>
+              <w:rPr>
+                <w:b w:val="false"/>
+                <w:bCs w:val="false"/>
+                <w:i w:val="false"/>
+                <w:iCs w:val="false"/>
+                <w:sz w:val="20"/>
+                <w:szCs w:val="20"/>
+              </w:rPr>
+              <w:t xml:space="preserve">8</w:t>
+            </w:r>
+          </w:p>
+        </w:tc>
+        <w:tc>
+          <w:tcPr>
+            <w:tcW w:type="dxa" w:w="3117"/>
+            <w:tcMar>
+              <w:top w:type="dxa" w:w="80"/>
+              <w:left w:type="dxa" w:w="120"/>
+              <w:bottom w:type="dxa" w:w="80"/>
+              <w:right w:type="dxa" w:w="120"/>
+            </w:tcMar>
+            <w:vAlign w:val="center"/>
+          </w:tcPr>
+          <w:p>
+            <w:r>
+              <w:rPr>
+                <w:b w:val="false"/>
+                <w:bCs w:val="false"/>
+                <w:i w:val="false"/>
+                <w:iCs w:val="false"/>
+                <w:sz w:val="20"/>
+                <w:szCs w:val="20"/>
+              </w:rPr>
+              <w:t xml:space="preserve">2.617</w:t>
+            </w:r>
+          </w:p>
+        </w:tc>
+        <w:tc>
+          <w:tcPr>
+            <w:tcW w:type="dxa" w:w="3117"/>
+            <w:tcMar>
+              <w:top w:type="dxa" w:w="80"/>
+              <w:left w:type="dxa" w:w="120"/>
+              <w:bottom w:type="dxa" w:w="80"/>
+              <w:right w:type="dxa" w:w="120"/>
+            </w:tcMar>
+            <w:vAlign w:val="center"/>
+          </w:tcPr>
+          <w:p>
+            <w:r>
+              <w:rPr>
+                <w:b w:val="false"/>
+                <w:bCs w:val="false"/>
+                <w:i w:val="false"/>
+                <w:iCs w:val="false"/>
+                <w:sz w:val="20"/>
+                <w:szCs w:val="20"/>
+              </w:rPr>
+              <w:t xml:space="preserve">0,450</w:t>
+            </w:r>
+          </w:p>
+        </w:tc>
+      </w:tr>
+    </w:tbl>
+    <w:p>
+      <w:pPr>
+        <w:spacing w:after="160"/>
+      </w:pPr>
+    </w:p>
+    <w:p>
+      <w:pPr>
+        <w:spacing w:after="160"/>
+        <w:jc w:val="both"/>
+      </w:pPr>
+      <w:r>
+        <w:rPr>
+          <w:b w:val="false"/>
+          <w:bCs w:val="false"/>
+          <w:i w:val="false"/>
+          <w:iCs w:val="false"/>
+          <w:sz w:val="22"/>
+          <w:szCs w:val="22"/>
+        </w:rPr>
+        <w:t xml:space="preserve">El codo se ubica en </w:t>
+      </w:r>
+      <w:r>
+        <w:rPr>
+          <w:b/>
+          <w:bCs/>
+          <w:i w:val="false"/>
+          <w:iCs w:val="false"/>
+          <w:sz w:val="22"/>
+          <w:szCs w:val="22"/>
+        </w:rPr>
+        <w:t xml:space="preserve">k = 4</w:t>
+      </w:r>
+      <w:r>
+        <w:rPr>
+          <w:b w:val="false"/>
+          <w:bCs w:val="false"/>
+          <w:i w:val="false"/>
+          <w:iCs w:val="false"/>
+          <w:sz w:val="22"/>
+          <w:szCs w:val="22"/>
+        </w:rPr>
+        <w:t xml:space="preserve"> (la inercia cae fuerte de 3 a 4 y después se aplana). El silhouette es máximo en k = 3 (0,486), pero la diferencia con k = 4 (0,473) es chica. Se eligió </w:t>
+      </w:r>
+      <w:r>
+        <w:rPr>
+          <w:b/>
+          <w:bCs/>
+          <w:i w:val="false"/>
+          <w:iCs w:val="false"/>
+          <w:sz w:val="22"/>
+          <w:szCs w:val="22"/>
+        </w:rPr>
+        <w:t xml:space="preserve">k = 4</w:t>
+      </w:r>
+      <w:r>
+        <w:rPr>
+          <w:b w:val="false"/>
+          <w:bCs w:val="false"/>
+          <w:i w:val="false"/>
+          <w:iCs w:val="false"/>
+          <w:sz w:val="22"/>
+          <w:szCs w:val="22"/>
+        </w:rPr>
+        <w:t xml:space="preserve"> porque separa grupos que se pueden explicar físicamente.</w:t>
+      </w:r>
+    </w:p>
+    <w:p>
+      <w:pPr>
+        <w:pStyle w:val="Heading2"/>
+        <w:spacing w:after="140" w:before="280"/>
+      </w:pPr>
+      <w:r>
+        <w:rPr>
+          <w:b/>
+          <w:bCs/>
+          <w:i w:val="false"/>
+          <w:iCs w:val="false"/>
+          <w:color w:val="2E5395"/>
+          <w:sz w:val="24"/>
+          <w:szCs w:val="24"/>
+        </w:rPr>
+        <w:t xml:space="preserve">11.5 Perfil de los clusters</w:t>
+      </w:r>
+    </w:p>
+    <w:p>
+      <w:pPr>
+        <w:spacing w:after="160"/>
+        <w:jc w:val="both"/>
+      </w:pPr>
+      <w:r>
+        <w:rPr>
+          <w:b w:val="false"/>
+          <w:bCs w:val="false"/>
+          <w:i w:val="false"/>
+          <w:iCs w:val="false"/>
+          <w:sz w:val="22"/>
+          <w:szCs w:val="22"/>
+        </w:rPr>
+        <w:t xml:space="preserve">Valores típicos (mediana) calculados con las variables originales, sin logaritmo ni recorte:</w:t>
+      </w:r>
+    </w:p>
+    <w:tbl>
+      <w:tblPr>
+        <w:tblW w:type="dxa" w:w="9350"/>
+        <w:tblBorders>
+          <w:top w:val="single" w:color="B0B0B0" w:sz="2"/>
+          <w:left w:val="single" w:color="B0B0B0" w:sz="2"/>
+          <w:bottom w:val="single" w:color="B0B0B0" w:sz="2"/>
+          <w:right w:val="single" w:color="B0B0B0" w:sz="2"/>
+          <w:insideH w:val="single" w:color="D9D9D9" w:sz="2"/>
+          <w:insideV w:val="single" w:color="D9D9D9" w:sz="2"/>
+        </w:tblBorders>
+      </w:tblPr>
+      <w:tblGrid>
+        <w:gridCol w:w="900"/>
+        <w:gridCol w:w="3250"/>
+        <w:gridCol w:w="900"/>
+        <w:gridCol w:w="1400"/>
+        <w:gridCol w:w="1700"/>
+        <w:gridCol w:w="1200"/>
+      </w:tblGrid>
+      <w:tr>
+        <w:trPr>
+          <w:tblHeader/>
+        </w:trPr>
+        <w:tc>
+          <w:tcPr>
+            <w:tcW w:type="dxa" w:w="900"/>
+            <w:shd w:fill="1F3864" w:val="clear"/>
+            <w:tcMar>
+              <w:top w:type="dxa" w:w="80"/>
+              <w:left w:type="dxa" w:w="120"/>
+              <w:bottom w:type="dxa" w:w="80"/>
+              <w:right w:type="dxa" w:w="120"/>
+            </w:tcMar>
+            <w:vAlign w:val="center"/>
+          </w:tcPr>
+          <w:p>
+            <w:r>
+              <w:rPr>
+                <w:b/>
+                <w:bCs/>
+                <w:i w:val="false"/>
+                <w:iCs w:val="false"/>
+                <w:color w:val="FFFFFF"/>
+                <w:sz w:val="20"/>
+                <w:szCs w:val="20"/>
+              </w:rPr>
+              <w:t xml:space="preserve">Cluster</w:t>
+            </w:r>
+          </w:p>
+        </w:tc>
+        <w:tc>
+          <w:tcPr>
+            <w:tcW w:type="dxa" w:w="3250"/>
+            <w:shd w:fill="1F3864" w:val="clear"/>
+            <w:tcMar>
+              <w:top w:type="dxa" w:w="80"/>
+              <w:left w:type="dxa" w:w="120"/>
+              <w:bottom w:type="dxa" w:w="80"/>
+              <w:right w:type="dxa" w:w="120"/>
+            </w:tcMar>
+            <w:vAlign w:val="center"/>
+          </w:tcPr>
+          <w:p>
+            <w:r>
+              <w:rPr>
+                <w:b/>
+                <w:bCs/>
+                <w:i w:val="false"/>
+                <w:iCs w:val="false"/>
+                <w:color w:val="FFFFFF"/>
+                <w:sz w:val="20"/>
+                <w:szCs w:val="20"/>
+              </w:rPr>
+              <w:t xml:space="preserve">Interpretación</w:t>
+            </w:r>
+          </w:p>
+        </w:tc>
+        <w:tc>
+          <w:tcPr>
+            <w:tcW w:type="dxa" w:w="900"/>
+            <w:shd w:fill="1F3864" w:val="clear"/>
+            <w:tcMar>
+              <w:top w:type="dxa" w:w="80"/>
+              <w:left w:type="dxa" w:w="120"/>
+              <w:bottom w:type="dxa" w:w="80"/>
+              <w:right w:type="dxa" w:w="120"/>
+            </w:tcMar>
+            <w:vAlign w:val="center"/>
+          </w:tcPr>
+          <w:p>
+            <w:r>
+              <w:rPr>
+                <w:b/>
+                <w:bCs/>
+                <w:i w:val="false"/>
+                <w:iCs w:val="false"/>
+                <w:color w:val="FFFFFF"/>
+                <w:sz w:val="20"/>
+                <w:szCs w:val="20"/>
+              </w:rPr>
+              <w:t xml:space="preserve">Pozos</w:t>
+            </w:r>
+          </w:p>
+        </w:tc>
+        <w:tc>
+          <w:tcPr>
+            <w:tcW w:type="dxa" w:w="1400"/>
+            <w:shd w:fill="1F3864" w:val="clear"/>
+            <w:tcMar>
+              <w:top w:type="dxa" w:w="80"/>
+              <w:left w:type="dxa" w:w="120"/>
+              <w:bottom w:type="dxa" w:w="80"/>
+              <w:right w:type="dxa" w:w="120"/>
+            </w:tcMar>
+            <w:vAlign w:val="center"/>
+          </w:tcPr>
+          <w:p>
+            <w:r>
+              <w:rPr>
+                <w:b/>
+                <w:bCs/>
+                <w:i w:val="false"/>
+                <w:iCs w:val="false"/>
+                <w:color w:val="FFFFFF"/>
+                <w:sz w:val="20"/>
+                <w:szCs w:val="20"/>
+              </w:rPr>
+              <w:t xml:space="preserve">Pico prod_pet</w:t>
+            </w:r>
+          </w:p>
+        </w:tc>
+        <w:tc>
+          <w:tcPr>
+            <w:tcW w:type="dxa" w:w="1700"/>
+            <w:shd w:fill="1F3864" w:val="clear"/>
+            <w:tcMar>
+              <w:top w:type="dxa" w:w="80"/>
+              <w:left w:type="dxa" w:w="120"/>
+              <w:bottom w:type="dxa" w:w="80"/>
+              <w:right w:type="dxa" w:w="120"/>
+            </w:tcMar>
+            <w:vAlign w:val="center"/>
+          </w:tcPr>
+          <w:p>
+            <w:r>
+              <w:rPr>
+                <w:b/>
+                <w:bCs/>
+                <w:i w:val="false"/>
+                <w:iCs w:val="false"/>
+                <w:color w:val="FFFFFF"/>
+                <w:sz w:val="20"/>
+                <w:szCs w:val="20"/>
+              </w:rPr>
+              <w:t xml:space="preserve">Antigüedad (meses)</w:t>
+            </w:r>
+          </w:p>
+        </w:tc>
+        <w:tc>
+          <w:tcPr>
+            <w:tcW w:type="dxa" w:w="1200"/>
+            <w:shd w:fill="1F3864" w:val="clear"/>
+            <w:tcMar>
+              <w:top w:type="dxa" w:w="80"/>
+              <w:left w:type="dxa" w:w="120"/>
+              <w:bottom w:type="dxa" w:w="80"/>
+              <w:right w:type="dxa" w:w="120"/>
+            </w:tcMar>
+            <w:vAlign w:val="center"/>
+          </w:tcPr>
+          <w:p>
+            <w:r>
+              <w:rPr>
+                <w:b/>
+                <w:bCs/>
+                <w:i w:val="false"/>
+                <w:iCs w:val="false"/>
+                <w:color w:val="FFFFFF"/>
+                <w:sz w:val="20"/>
+                <w:szCs w:val="20"/>
+              </w:rPr>
+              <w:t xml:space="preserve">Ratio gas/pet</w:t>
+            </w:r>
+          </w:p>
+        </w:tc>
+      </w:tr>
+      <w:tr>
+        <w:tc>
+          <w:tcPr>
+            <w:tcW w:type="dxa" w:w="900"/>
+            <w:tcMar>
+              <w:top w:type="dxa" w:w="80"/>
+              <w:left w:type="dxa" w:w="120"/>
+              <w:bottom w:type="dxa" w:w="80"/>
+              <w:right w:type="dxa" w:w="120"/>
+            </w:tcMar>
+            <w:vAlign w:val="center"/>
+          </w:tcPr>
+          <w:p>
+            <w:r>
+              <w:rPr>
+                <w:b w:val="false"/>
+                <w:bCs w:val="false"/>
+                <w:i w:val="false"/>
+                <w:iCs w:val="false"/>
+                <w:sz w:val="20"/>
+                <w:szCs w:val="20"/>
+              </w:rPr>
+              <w:t xml:space="preserve">3</w:t>
+            </w:r>
+          </w:p>
+        </w:tc>
+        <w:tc>
+          <w:tcPr>
+            <w:tcW w:type="dxa" w:w="3250"/>
+            <w:tcMar>
+              <w:top w:type="dxa" w:w="80"/>
+              <w:left w:type="dxa" w:w="120"/>
+              <w:bottom w:type="dxa" w:w="80"/>
+              <w:right w:type="dxa" w:w="120"/>
+            </w:tcMar>
+            <w:vAlign w:val="center"/>
+          </w:tcPr>
+          <w:p>
+            <w:r>
+              <w:rPr>
+                <w:b/>
+                <w:bCs/>
+                <w:i w:val="false"/>
+                <w:iCs w:val="false"/>
+                <w:sz w:val="20"/>
+                <w:szCs w:val="20"/>
+              </w:rPr>
+              <w:t xml:space="preserve">Modernos de alta producción de petróleo</w:t>
+            </w:r>
+            <w:r>
+              <w:rPr>
+                <w:b w:val="false"/>
+                <w:bCs w:val="false"/>
+                <w:i w:val="false"/>
+                <w:iCs w:val="false"/>
+                <w:sz w:val="20"/>
+                <w:szCs w:val="20"/>
+              </w:rPr>
+              <w:t xml:space="preserve"> (tipo Vaca Muerta)</w:t>
+            </w:r>
+          </w:p>
+        </w:tc>
+        <w:tc>
+          <w:tcPr>
+            <w:tcW w:type="dxa" w:w="900"/>
+            <w:tcMar>
+              <w:top w:type="dxa" w:w="80"/>
+              <w:left w:type="dxa" w:w="120"/>
+              <w:bottom w:type="dxa" w:w="80"/>
+              <w:right w:type="dxa" w:w="120"/>
+            </w:tcMar>
+            <w:vAlign w:val="center"/>
+          </w:tcPr>
+          <w:p>
+            <w:r>
+              <w:rPr>
+                <w:b w:val="false"/>
+                <w:bCs w:val="false"/>
+                <w:i w:val="false"/>
+                <w:iCs w:val="false"/>
+                <w:sz w:val="20"/>
+                <w:szCs w:val="20"/>
+              </w:rPr>
+              <w:t xml:space="preserve">2.009</w:t>
+            </w:r>
+          </w:p>
+        </w:tc>
+        <w:tc>
+          <w:tcPr>
+            <w:tcW w:type="dxa" w:w="1400"/>
+            <w:tcMar>
+              <w:top w:type="dxa" w:w="80"/>
+              <w:left w:type="dxa" w:w="120"/>
+              <w:bottom w:type="dxa" w:w="80"/>
+              <w:right w:type="dxa" w:w="120"/>
+            </w:tcMar>
+            <w:vAlign w:val="center"/>
+          </w:tcPr>
+          <w:p>
+            <w:r>
+              <w:rPr>
+                <w:b w:val="false"/>
+                <w:bCs w:val="false"/>
+                <w:i w:val="false"/>
+                <w:iCs w:val="false"/>
+                <w:sz w:val="20"/>
+                <w:szCs w:val="20"/>
+              </w:rPr>
+              <w:t xml:space="preserve">5.273</w:t>
+            </w:r>
+          </w:p>
+        </w:tc>
+        <w:tc>
+          <w:tcPr>
+            <w:tcW w:type="dxa" w:w="1700"/>
+            <w:tcMar>
+              <w:top w:type="dxa" w:w="80"/>
+              <w:left w:type="dxa" w:w="120"/>
+              <w:bottom w:type="dxa" w:w="80"/>
+              <w:right w:type="dxa" w:w="120"/>
+            </w:tcMar>
+            <w:vAlign w:val="center"/>
+          </w:tcPr>
+          <w:p>
+            <w:r>
+              <w:rPr>
+                <w:b w:val="false"/>
+                <w:bCs w:val="false"/>
+                <w:i w:val="false"/>
+                <w:iCs w:val="false"/>
+                <w:sz w:val="20"/>
+                <w:szCs w:val="20"/>
+              </w:rPr>
+              <w:t xml:space="preserve">33</w:t>
+            </w:r>
+          </w:p>
+        </w:tc>
+        <w:tc>
+          <w:tcPr>
+            <w:tcW w:type="dxa" w:w="1200"/>
+            <w:tcMar>
+              <w:top w:type="dxa" w:w="80"/>
+              <w:left w:type="dxa" w:w="120"/>
+              <w:bottom w:type="dxa" w:w="80"/>
+              <w:right w:type="dxa" w:w="120"/>
+            </w:tcMar>
+            <w:vAlign w:val="center"/>
+          </w:tcPr>
+          <w:p>
+            <w:r>
+              <w:rPr>
+                <w:b w:val="false"/>
+                <w:bCs w:val="false"/>
+                <w:i w:val="false"/>
+                <w:iCs w:val="false"/>
+                <w:sz w:val="20"/>
+                <w:szCs w:val="20"/>
+              </w:rPr>
+              <w:t xml:space="preserve">0,14</w:t>
+            </w:r>
+          </w:p>
+        </w:tc>
+      </w:tr>
+      <w:tr>
+        <w:tc>
+          <w:tcPr>
+            <w:tcW w:type="dxa" w:w="900"/>
+            <w:tcMar>
+              <w:top w:type="dxa" w:w="80"/>
+              <w:left w:type="dxa" w:w="120"/>
+              <w:bottom w:type="dxa" w:w="80"/>
+              <w:right w:type="dxa" w:w="120"/>
+            </w:tcMar>
+            <w:vAlign w:val="center"/>
+          </w:tcPr>
+          <w:p>
+            <w:r>
+              <w:rPr>
+                <w:b w:val="false"/>
+                <w:bCs w:val="false"/>
+                <w:i w:val="false"/>
+                <w:iCs w:val="false"/>
+                <w:sz w:val="20"/>
+                <w:szCs w:val="20"/>
+              </w:rPr>
+              <w:t xml:space="preserve">1</w:t>
+            </w:r>
+          </w:p>
+        </w:tc>
+        <w:tc>
+          <w:tcPr>
+            <w:tcW w:type="dxa" w:w="3250"/>
+            <w:tcMar>
+              <w:top w:type="dxa" w:w="80"/>
+              <w:left w:type="dxa" w:w="120"/>
+              <w:bottom w:type="dxa" w:w="80"/>
+              <w:right w:type="dxa" w:w="120"/>
+            </w:tcMar>
+            <w:vAlign w:val="center"/>
+          </w:tcPr>
+          <w:p>
+            <w:r>
+              <w:rPr>
+                <w:b/>
+                <w:bCs/>
+                <w:i w:val="false"/>
+                <w:iCs w:val="false"/>
+                <w:sz w:val="20"/>
+                <w:szCs w:val="20"/>
+              </w:rPr>
+              <w:t xml:space="preserve">Viejos de producción media</w:t>
+            </w:r>
+          </w:p>
+        </w:tc>
+        <w:tc>
+          <w:tcPr>
+            <w:tcW w:type="dxa" w:w="900"/>
+            <w:tcMar>
+              <w:top w:type="dxa" w:w="80"/>
+              <w:left w:type="dxa" w:w="120"/>
+              <w:bottom w:type="dxa" w:w="80"/>
+              <w:right w:type="dxa" w:w="120"/>
+            </w:tcMar>
+            <w:vAlign w:val="center"/>
+          </w:tcPr>
+          <w:p>
+            <w:r>
+              <w:rPr>
+                <w:b w:val="false"/>
+                <w:bCs w:val="false"/>
+                <w:i w:val="false"/>
+                <w:iCs w:val="false"/>
+                <w:sz w:val="20"/>
+                <w:szCs w:val="20"/>
+              </w:rPr>
+              <w:t xml:space="preserve">1.123</w:t>
+            </w:r>
+          </w:p>
+        </w:tc>
+        <w:tc>
+          <w:tcPr>
+            <w:tcW w:type="dxa" w:w="1400"/>
+            <w:tcMar>
+              <w:top w:type="dxa" w:w="80"/>
+              <w:left w:type="dxa" w:w="120"/>
+              <w:bottom w:type="dxa" w:w="80"/>
+              <w:right w:type="dxa" w:w="120"/>
+            </w:tcMar>
+            <w:vAlign w:val="center"/>
+          </w:tcPr>
+          <w:p>
+            <w:r>
+              <w:rPr>
+                <w:b w:val="false"/>
+                <w:bCs w:val="false"/>
+                <w:i w:val="false"/>
+                <w:iCs w:val="false"/>
+                <w:sz w:val="20"/>
+                <w:szCs w:val="20"/>
+              </w:rPr>
+              <w:t xml:space="preserve">809</w:t>
+            </w:r>
+          </w:p>
+        </w:tc>
+        <w:tc>
+          <w:tcPr>
+            <w:tcW w:type="dxa" w:w="1700"/>
+            <w:tcMar>
+              <w:top w:type="dxa" w:w="80"/>
+              <w:left w:type="dxa" w:w="120"/>
+              <w:bottom w:type="dxa" w:w="80"/>
+              <w:right w:type="dxa" w:w="120"/>
+            </w:tcMar>
+            <w:vAlign w:val="center"/>
+          </w:tcPr>
+          <w:p>
+            <w:r>
+              <w:rPr>
+                <w:b w:val="false"/>
+                <w:bCs w:val="false"/>
+                <w:i w:val="false"/>
+                <w:iCs w:val="false"/>
+                <w:sz w:val="20"/>
+                <w:szCs w:val="20"/>
+              </w:rPr>
+              <w:t xml:space="preserve">138</w:t>
+            </w:r>
+          </w:p>
+        </w:tc>
+        <w:tc>
+          <w:tcPr>
+            <w:tcW w:type="dxa" w:w="1200"/>
+            <w:tcMar>
+              <w:top w:type="dxa" w:w="80"/>
+              <w:left w:type="dxa" w:w="120"/>
+              <w:bottom w:type="dxa" w:w="80"/>
+              <w:right w:type="dxa" w:w="120"/>
+            </w:tcMar>
+            <w:vAlign w:val="center"/>
+          </w:tcPr>
+          <w:p>
+            <w:r>
+              <w:rPr>
+                <w:b w:val="false"/>
+                <w:bCs w:val="false"/>
+                <w:i w:val="false"/>
+                <w:iCs w:val="false"/>
+                <w:sz w:val="20"/>
+                <w:szCs w:val="20"/>
+              </w:rPr>
+              <w:t xml:space="preserve">0,98</w:t>
+            </w:r>
+          </w:p>
+        </w:tc>
+      </w:tr>
+      <w:tr>
+        <w:tc>
+          <w:tcPr>
+            <w:tcW w:type="dxa" w:w="900"/>
+            <w:tcMar>
+              <w:top w:type="dxa" w:w="80"/>
+              <w:left w:type="dxa" w:w="120"/>
+              <w:bottom w:type="dxa" w:w="80"/>
+              <w:right w:type="dxa" w:w="120"/>
+            </w:tcMar>
+            <w:vAlign w:val="center"/>
+          </w:tcPr>
+          <w:p>
+            <w:r>
+              <w:rPr>
+                <w:b w:val="false"/>
+                <w:bCs w:val="false"/>
+                <w:i w:val="false"/>
+                <w:iCs w:val="false"/>
+                <w:sz w:val="20"/>
+                <w:szCs w:val="20"/>
+              </w:rPr>
+              <w:t xml:space="preserve">0</w:t>
+            </w:r>
+          </w:p>
+        </w:tc>
+        <w:tc>
+          <w:tcPr>
+            <w:tcW w:type="dxa" w:w="3250"/>
+            <w:tcMar>
+              <w:top w:type="dxa" w:w="80"/>
+              <w:left w:type="dxa" w:w="120"/>
+              <w:bottom w:type="dxa" w:w="80"/>
+              <w:right w:type="dxa" w:w="120"/>
+            </w:tcMar>
+            <w:vAlign w:val="center"/>
+          </w:tcPr>
+          <w:p>
+            <w:r>
+              <w:rPr>
+                <w:b/>
+                <w:bCs/>
+                <w:i w:val="false"/>
+                <w:iCs w:val="false"/>
+                <w:sz w:val="20"/>
+                <w:szCs w:val="20"/>
+              </w:rPr>
+              <w:t xml:space="preserve">Viejos con mucho gas y casi nada de petróleo</w:t>
+            </w:r>
+          </w:p>
+        </w:tc>
+        <w:tc>
+          <w:tcPr>
+            <w:tcW w:type="dxa" w:w="900"/>
+            <w:tcMar>
+              <w:top w:type="dxa" w:w="80"/>
+              <w:left w:type="dxa" w:w="120"/>
+              <w:bottom w:type="dxa" w:w="80"/>
+              <w:right w:type="dxa" w:w="120"/>
+            </w:tcMar>
+            <w:vAlign w:val="center"/>
+          </w:tcPr>
+          <w:p>
+            <w:r>
+              <w:rPr>
+                <w:b w:val="false"/>
+                <w:bCs w:val="false"/>
+                <w:i w:val="false"/>
+                <w:iCs w:val="false"/>
+                <w:sz w:val="20"/>
+                <w:szCs w:val="20"/>
+              </w:rPr>
+              <w:t xml:space="preserve">1.088</w:t>
+            </w:r>
+          </w:p>
+        </w:tc>
+        <w:tc>
+          <w:tcPr>
+            <w:tcW w:type="dxa" w:w="1400"/>
+            <w:tcMar>
+              <w:top w:type="dxa" w:w="80"/>
+              <w:left w:type="dxa" w:w="120"/>
+              <w:bottom w:type="dxa" w:w="80"/>
+              <w:right w:type="dxa" w:w="120"/>
+            </w:tcMar>
+            <w:vAlign w:val="center"/>
+          </w:tcPr>
+          <w:p>
+            <w:r>
+              <w:rPr>
+                <w:b w:val="false"/>
+                <w:bCs w:val="false"/>
+                <w:i w:val="false"/>
+                <w:iCs w:val="false"/>
+                <w:sz w:val="20"/>
+                <w:szCs w:val="20"/>
+              </w:rPr>
+              <w:t xml:space="preserve">53</w:t>
+            </w:r>
+          </w:p>
+        </w:tc>
+        <w:tc>
+          <w:tcPr>
+            <w:tcW w:type="dxa" w:w="1700"/>
+            <w:tcMar>
+              <w:top w:type="dxa" w:w="80"/>
+              <w:left w:type="dxa" w:w="120"/>
+              <w:bottom w:type="dxa" w:w="80"/>
+              <w:right w:type="dxa" w:w="120"/>
+            </w:tcMar>
+            <w:vAlign w:val="center"/>
+          </w:tcPr>
+          <w:p>
+            <w:r>
+              <w:rPr>
+                <w:b w:val="false"/>
+                <w:bCs w:val="false"/>
+                <w:i w:val="false"/>
+                <w:iCs w:val="false"/>
+                <w:sz w:val="20"/>
+                <w:szCs w:val="20"/>
+              </w:rPr>
+              <w:t xml:space="preserve">105</w:t>
+            </w:r>
+          </w:p>
+        </w:tc>
+        <w:tc>
+          <w:tcPr>
+            <w:tcW w:type="dxa" w:w="1200"/>
+            <w:tcMar>
+              <w:top w:type="dxa" w:w="80"/>
+              <w:left w:type="dxa" w:w="120"/>
+              <w:bottom w:type="dxa" w:w="80"/>
+              <w:right w:type="dxa" w:w="120"/>
+            </w:tcMar>
+            <w:vAlign w:val="center"/>
+          </w:tcPr>
+          <w:p>
+            <w:r>
+              <w:rPr>
+                <w:b w:val="false"/>
+                <w:bCs w:val="false"/>
+                <w:i w:val="false"/>
+                <w:iCs w:val="false"/>
+                <w:sz w:val="20"/>
+                <w:szCs w:val="20"/>
+              </w:rPr>
+              <w:t xml:space="preserve">55,0</w:t>
+            </w:r>
+          </w:p>
+        </w:tc>
+      </w:tr>
+      <w:tr>
+        <w:tc>
+          <w:tcPr>
+            <w:tcW w:type="dxa" w:w="900"/>
+            <w:tcMar>
+              <w:top w:type="dxa" w:w="80"/>
+              <w:left w:type="dxa" w:w="120"/>
+              <w:bottom w:type="dxa" w:w="80"/>
+              <w:right w:type="dxa" w:w="120"/>
+            </w:tcMar>
+            <w:vAlign w:val="center"/>
+          </w:tcPr>
+          <w:p>
+            <w:r>
+              <w:rPr>
+                <w:b w:val="false"/>
+                <w:bCs w:val="false"/>
+                <w:i w:val="false"/>
+                <w:iCs w:val="false"/>
+                <w:sz w:val="20"/>
+                <w:szCs w:val="20"/>
+              </w:rPr>
+              <w:t xml:space="preserve">2</w:t>
+            </w:r>
+          </w:p>
+        </w:tc>
+        <w:tc>
+          <w:tcPr>
+            <w:tcW w:type="dxa" w:w="3250"/>
+            <w:tcMar>
+              <w:top w:type="dxa" w:w="80"/>
+              <w:left w:type="dxa" w:w="120"/>
+              <w:bottom w:type="dxa" w:w="80"/>
+              <w:right w:type="dxa" w:w="120"/>
+            </w:tcMar>
+            <w:vAlign w:val="center"/>
+          </w:tcPr>
+          <w:p>
+            <w:r>
+              <w:rPr>
+                <w:b/>
+                <w:bCs/>
+                <w:i w:val="false"/>
+                <w:iCs w:val="false"/>
+                <w:sz w:val="20"/>
+                <w:szCs w:val="20"/>
+              </w:rPr>
+              <w:t xml:space="preserve">Recién puestos en producción</w:t>
+            </w:r>
+            <w:r>
+              <w:rPr>
+                <w:b w:val="false"/>
+                <w:bCs w:val="false"/>
+                <w:i w:val="false"/>
+                <w:iCs w:val="false"/>
+                <w:sz w:val="20"/>
+                <w:szCs w:val="20"/>
+              </w:rPr>
+              <w:t xml:space="preserve"> (3 a 5 meses de historia, ya pasado su pico inicial)</w:t>
+            </w:r>
+          </w:p>
+        </w:tc>
+        <w:tc>
+          <w:tcPr>
+            <w:tcW w:type="dxa" w:w="900"/>
+            <w:tcMar>
+              <w:top w:type="dxa" w:w="80"/>
+              <w:left w:type="dxa" w:w="120"/>
+              <w:bottom w:type="dxa" w:w="80"/>
+              <w:right w:type="dxa" w:w="120"/>
+            </w:tcMar>
+            <w:vAlign w:val="center"/>
+          </w:tcPr>
+          <w:p>
+            <w:r>
+              <w:rPr>
+                <w:b w:val="false"/>
+                <w:bCs w:val="false"/>
+                <w:i w:val="false"/>
+                <w:iCs w:val="false"/>
+                <w:sz w:val="20"/>
+                <w:szCs w:val="20"/>
+              </w:rPr>
+              <w:t xml:space="preserve">75</w:t>
+            </w:r>
+          </w:p>
+        </w:tc>
+        <w:tc>
+          <w:tcPr>
+            <w:tcW w:type="dxa" w:w="1400"/>
+            <w:tcMar>
+              <w:top w:type="dxa" w:w="80"/>
+              <w:left w:type="dxa" w:w="120"/>
+              <w:bottom w:type="dxa" w:w="80"/>
+              <w:right w:type="dxa" w:w="120"/>
+            </w:tcMar>
+            <w:vAlign w:val="center"/>
+          </w:tcPr>
+          <w:p>
+            <w:r>
+              <w:rPr>
+                <w:b w:val="false"/>
+                <w:bCs w:val="false"/>
+                <w:i w:val="false"/>
+                <w:iCs w:val="false"/>
+                <w:sz w:val="20"/>
+                <w:szCs w:val="20"/>
+              </w:rPr>
+              <w:t xml:space="preserve">6.053</w:t>
+            </w:r>
+          </w:p>
+        </w:tc>
+        <w:tc>
+          <w:tcPr>
+            <w:tcW w:type="dxa" w:w="1700"/>
+            <w:tcMar>
+              <w:top w:type="dxa" w:w="80"/>
+              <w:left w:type="dxa" w:w="120"/>
+              <w:bottom w:type="dxa" w:w="80"/>
+              <w:right w:type="dxa" w:w="120"/>
+            </w:tcMar>
+            <w:vAlign w:val="center"/>
+          </w:tcPr>
+          <w:p>
+            <w:r>
+              <w:rPr>
+                <w:b w:val="false"/>
+                <w:bCs w:val="false"/>
+                <w:i w:val="false"/>
+                <w:iCs w:val="false"/>
+                <w:sz w:val="20"/>
+                <w:szCs w:val="20"/>
+              </w:rPr>
+              <w:t xml:space="preserve">3</w:t>
+            </w:r>
+          </w:p>
+        </w:tc>
+        <w:tc>
+          <w:tcPr>
+            <w:tcW w:type="dxa" w:w="1200"/>
+            <w:tcMar>
+              <w:top w:type="dxa" w:w="80"/>
+              <w:left w:type="dxa" w:w="120"/>
+              <w:bottom w:type="dxa" w:w="80"/>
+              <w:right w:type="dxa" w:w="120"/>
+            </w:tcMar>
+            <w:vAlign w:val="center"/>
+          </w:tcPr>
+          <w:p>
+            <w:r>
+              <w:rPr>
+                <w:b w:val="false"/>
+                <w:bCs w:val="false"/>
+                <w:i w:val="false"/>
+                <w:iCs w:val="false"/>
+                <w:sz w:val="20"/>
+                <w:szCs w:val="20"/>
+              </w:rPr>
+              <w:t xml:space="preserve">0,20</w:t>
+            </w:r>
+          </w:p>
+        </w:tc>
+      </w:tr>
+    </w:tbl>
+    <w:p>
+      <w:pPr>
+        <w:spacing w:after="160"/>
+      </w:pPr>
+    </w:p>
+    <w:p>
+      <w:pPr>
+        <w:spacing w:after="160"/>
+        <w:jc w:val="both"/>
+      </w:pPr>
+      <w:r>
+        <w:rPr>
+          <w:b w:val="false"/>
+          <w:bCs w:val="false"/>
+          <w:i w:val="false"/>
+          <w:iCs w:val="false"/>
+          <w:sz w:val="22"/>
+          <w:szCs w:val="22"/>
+        </w:rPr>
+        <w:t xml:space="preserve">La declinación típica es casi igual en los tres clusters grandes (entre -0,02 y -0,04), así que </w:t>
+      </w:r>
+      <w:r>
+        <w:rPr>
+          <w:rFonts w:ascii="Consolas" w:cs="Consolas" w:eastAsia="Consolas" w:hAnsi="Consolas"/>
+          <w:b w:val="false"/>
+          <w:bCs w:val="false"/>
+          <w:color w:val="C0392B"/>
+          <w:sz w:val="20"/>
+          <w:szCs w:val="20"/>
+          <w:shd w:fill="F0F0F0" w:val="clear"/>
+        </w:rPr>
+        <w:t xml:space="preserve">declinacion_promedio</w:t>
+      </w:r>
+      <w:r>
+        <w:rPr>
+          <w:b w:val="false"/>
+          <w:bCs w:val="false"/>
+          <w:i w:val="false"/>
+          <w:iCs w:val="false"/>
+          <w:sz w:val="22"/>
+          <w:szCs w:val="22"/>
+        </w:rPr>
+        <w:t xml:space="preserve"> aporta poco para separarlos; los diferencian el pico, la antigüedad y el ratio. El cluster 2 se distingue por esa variable (mediana de 6,76) porque, con tan poca historia, su "declinación" es en realidad el crecimiento de arranque, no una curva de declinación.</w:t>
+      </w:r>
+    </w:p>
+    <w:p>
+      <w:pPr>
+        <w:pStyle w:val="Heading2"/>
+        <w:spacing w:after="140" w:before="280"/>
+      </w:pPr>
+      <w:r>
+        <w:rPr>
+          <w:b/>
+          <w:bCs/>
+          <w:i w:val="false"/>
+          <w:iCs w:val="false"/>
+          <w:color w:val="2E5395"/>
+          <w:sz w:val="24"/>
+          <w:szCs w:val="24"/>
+        </w:rPr>
+        <w:t xml:space="preserve">11.6 Validación visual</w:t>
+      </w:r>
+    </w:p>
+    <w:p>
+      <w:pPr>
+        <w:spacing w:after="100"/>
+        <w:ind w:left="300"/>
+      </w:pPr>
+      <w:r>
+        <w:rPr>
+          <w:b/>
+          <w:bCs/>
+          <w:color w:val="1F3864"/>
+          <w:sz w:val="22"/>
+          <w:szCs w:val="22"/>
+        </w:rPr>
+        <w:t xml:space="preserve">• </w:t>
+      </w:r>
+      <w:r>
+        <w:rPr>
+          <w:b/>
+          <w:bCs/>
+          <w:i w:val="false"/>
+          <w:iCs w:val="false"/>
+          <w:sz w:val="22"/>
+          <w:szCs w:val="22"/>
+        </w:rPr>
+        <w:t xml:space="preserve">PCA en 2D:</w:t>
+      </w:r>
+      <w:r>
+        <w:rPr>
+          <w:b w:val="false"/>
+          <w:bCs w:val="false"/>
+          <w:i w:val="false"/>
+          <w:iCs w:val="false"/>
+          <w:sz w:val="22"/>
+          <w:szCs w:val="22"/>
+        </w:rPr>
+        <w:t xml:space="preserve"> los dos componentes explican ≈ 79% de la información (55% + 24%). Los clusters 0, 1 y 3 forman un </w:t>
+      </w:r>
+      <w:r>
+        <w:rPr>
+          <w:b/>
+          <w:bCs/>
+          <w:i w:val="false"/>
+          <w:iCs w:val="false"/>
+          <w:sz w:val="22"/>
+          <w:szCs w:val="22"/>
+        </w:rPr>
+        <w:t xml:space="preserve">continuo</w:t>
+      </w:r>
+      <w:r>
+        <w:rPr>
+          <w:b w:val="false"/>
+          <w:bCs w:val="false"/>
+          <w:i w:val="false"/>
+          <w:iCs w:val="false"/>
+          <w:sz w:val="22"/>
+          <w:szCs w:val="22"/>
+        </w:rPr>
+        <w:t xml:space="preserve"> (de pozos chicos y gasíferos a pozos grandes y modernos) que K-Means corta en tres tramos, con solapamiento en los bordes. El cluster 2 sí se separa claramente. Es decir, el clustering segmenta una gradación de pozos, no descubre grupos totalmente aislados.</w:t>
+      </w:r>
+    </w:p>
+    <w:p>
+      <w:pPr>
+        <w:spacing w:after="100"/>
+        <w:ind w:left="300"/>
+      </w:pPr>
+      <w:r>
+        <w:rPr>
+          <w:b/>
+          <w:bCs/>
+          <w:color w:val="1F3864"/>
+          <w:sz w:val="22"/>
+          <w:szCs w:val="22"/>
+        </w:rPr>
+        <w:t xml:space="preserve">• </w:t>
+      </w:r>
+      <w:r>
+        <w:rPr>
+          <w:b/>
+          <w:bCs/>
+          <w:i w:val="false"/>
+          <w:iCs w:val="false"/>
+          <w:sz w:val="22"/>
+          <w:szCs w:val="22"/>
+        </w:rPr>
+        <w:t xml:space="preserve">Curvas representativas</w:t>
+      </w:r>
+      <w:r>
+        <w:rPr>
+          <w:b w:val="false"/>
+          <w:bCs w:val="false"/>
+          <w:i w:val="false"/>
+          <w:iCs w:val="false"/>
+          <w:sz w:val="22"/>
+          <w:szCs w:val="22"/>
+        </w:rPr>
+        <w:t xml:space="preserve"> (pozo más cercano al centro de cada cluster: 159285, 153344, 164529 y 167147): tienen sentido físico. El cluster 0 es una línea chata cerca de 50; el 1 muestra un pico chico y declinación lenta durante unos 140 meses; el 3 llega a ~4.400 y baja de forma sostenida; el 2 sube hasta ~6.400 en el mes 3 y empieza a bajar.</w:t>
+      </w:r>
+    </w:p>
+    <w:p>
+      <w:pPr>
+        <w:spacing w:after="160"/>
+      </w:pPr>
+    </w:p>
+    <w:p>
+      <w:pPr>
+        <w:pStyle w:val="Heading2"/>
+        <w:spacing w:after="140" w:before="280"/>
+      </w:pPr>
+      <w:r>
+        <w:rPr>
+          <w:b/>
+          <w:bCs/>
+          <w:i w:val="false"/>
+          <w:iCs w:val="false"/>
+          <w:color w:val="2E5395"/>
+          <w:sz w:val="24"/>
+          <w:szCs w:val="24"/>
+        </w:rPr>
+        <w:t xml:space="preserve">11.7 Cruce con la limitación del modelo supervisado</w:t>
+      </w:r>
+    </w:p>
+    <w:p>
+      <w:pPr>
+        <w:spacing w:after="160"/>
+        <w:jc w:val="both"/>
+      </w:pPr>
+      <w:r>
+        <w:rPr>
+          <w:b w:val="false"/>
+          <w:bCs w:val="false"/>
+          <w:i w:val="false"/>
+          <w:iCs w:val="false"/>
+          <w:sz w:val="22"/>
+          <w:szCs w:val="22"/>
+        </w:rPr>
+        <w:t xml:space="preserve">De los </w:t>
+      </w:r>
+      <w:r>
+        <w:rPr>
+          <w:b/>
+          <w:bCs/>
+          <w:i w:val="false"/>
+          <w:iCs w:val="false"/>
+          <w:sz w:val="22"/>
+          <w:szCs w:val="22"/>
+        </w:rPr>
+        <w:t xml:space="preserve">94 pozos con pico mayor a 10.000</w:t>
+      </w:r>
+      <w:r>
+        <w:rPr>
+          <w:b w:val="false"/>
+          <w:bCs w:val="false"/>
+          <w:i w:val="false"/>
+          <w:iCs w:val="false"/>
+          <w:sz w:val="22"/>
+          <w:szCs w:val="22"/>
+        </w:rPr>
+        <w:t xml:space="preserve">, 88 caen en el cluster de pozos modernos de alta producción y 6 en el de pozos recién puestos en producción. Es coherente con que son los pozos más productivos, pero no revela un subgrupo distinto: el cluster 3 es grande y la información que aporta es limitada. El clustering </w:t>
+      </w:r>
+      <w:r>
+        <w:rPr>
+          <w:b/>
+          <w:bCs/>
+          <w:i w:val="false"/>
+          <w:iCs w:val="false"/>
+          <w:sz w:val="22"/>
+          <w:szCs w:val="22"/>
+        </w:rPr>
+        <w:t xml:space="preserve">no confirma ni descarta</w:t>
+      </w:r>
+      <w:r>
+        <w:rPr>
+          <w:b w:val="false"/>
+          <w:bCs w:val="false"/>
+          <w:i w:val="false"/>
+          <w:iCs w:val="false"/>
+          <w:sz w:val="22"/>
+          <w:szCs w:val="22"/>
+        </w:rPr>
+        <w:t xml:space="preserve"> la hipótesis de reestimulación como causa de la subestimación del modelo.</w:t>
+      </w:r>
+    </w:p>
+    <w:p>
+      <w:pPr>
+        <w:pStyle w:val="Heading2"/>
+        <w:spacing w:after="140" w:before="280"/>
+      </w:pPr>
+      <w:r>
+        <w:rPr>
+          <w:b/>
+          <w:bCs/>
+          <w:i w:val="false"/>
+          <w:iCs w:val="false"/>
+          <w:color w:val="2E5395"/>
+          <w:sz w:val="24"/>
+          <w:szCs w:val="24"/>
+        </w:rPr>
+        <w:t xml:space="preserve">11.8 Limitaciones</w:t>
+      </w:r>
+    </w:p>
+    <w:p>
+      <w:pPr>
+        <w:spacing w:after="100"/>
+        <w:ind w:left="300"/>
+      </w:pPr>
+      <w:r>
+        <w:rPr>
+          <w:b/>
+          <w:bCs/>
+          <w:color w:val="1F3864"/>
+          <w:sz w:val="22"/>
+          <w:szCs w:val="22"/>
+        </w:rPr>
+        <w:t xml:space="preserve">• </w:t>
+      </w:r>
+      <w:r>
+        <w:rPr>
+          <w:b w:val="false"/>
+          <w:bCs w:val="false"/>
+          <w:i w:val="false"/>
+          <w:iCs w:val="false"/>
+          <w:sz w:val="22"/>
+          <w:szCs w:val="22"/>
+        </w:rPr>
+        <w:t xml:space="preserve">El silhouette (≈ 0,47) indica una estructura moderada: hay grupos reales, pero se solapan en parte.</w:t>
+      </w:r>
+    </w:p>
+    <w:p>
+      <w:pPr>
+        <w:spacing w:after="100"/>
+        <w:ind w:left="300"/>
+      </w:pPr>
+      <w:r>
+        <w:rPr>
+          <w:b/>
+          <w:bCs/>
+          <w:color w:val="1F3864"/>
+          <w:sz w:val="22"/>
+          <w:szCs w:val="22"/>
+        </w:rPr>
+        <w:t xml:space="preserve">• </w:t>
+      </w:r>
+      <w:r>
+        <w:rPr>
+          <w:rFonts w:ascii="Consolas" w:cs="Consolas" w:eastAsia="Consolas" w:hAnsi="Consolas"/>
+          <w:b w:val="false"/>
+          <w:bCs w:val="false"/>
+          <w:color w:val="C0392B"/>
+          <w:sz w:val="20"/>
+          <w:szCs w:val="20"/>
+          <w:shd w:fill="F0F0F0" w:val="clear"/>
+        </w:rPr>
+        <w:t xml:space="preserve">declinacion_promedio</w:t>
+      </w:r>
+      <w:r>
+        <w:rPr>
+          <w:b w:val="false"/>
+          <w:bCs w:val="false"/>
+          <w:i w:val="false"/>
+          <w:iCs w:val="false"/>
+          <w:sz w:val="22"/>
+          <w:szCs w:val="22"/>
+        </w:rPr>
+        <w:t xml:space="preserve"> casi no separa los clusters grandes. Una mejora futura sería ajustar curvas de Arps por pozo.</w:t>
+      </w:r>
+    </w:p>
+    <w:p>
+      <w:pPr>
+        <w:spacing w:after="100"/>
+        <w:ind w:left="300"/>
+      </w:pPr>
+      <w:r>
+        <w:rPr>
+          <w:b/>
+          <w:bCs/>
+          <w:color w:val="1F3864"/>
+          <w:sz w:val="22"/>
+          <w:szCs w:val="22"/>
+        </w:rPr>
+        <w:t xml:space="preserve">• </w:t>
+      </w:r>
+      <w:r>
+        <w:rPr>
+          <w:b w:val="false"/>
+          <w:bCs w:val="false"/>
+          <w:i w:val="false"/>
+          <w:iCs w:val="false"/>
+          <w:sz w:val="22"/>
+          <w:szCs w:val="22"/>
+        </w:rPr>
+        <w:t xml:space="preserve">Los pozos gasíferos puros y los de muy poca historia quedan fuera del análisis.</w:t>
+      </w:r>
+    </w:p>
+    <w:p>
+      <w:pPr>
+        <w:pStyle w:val="Heading2"/>
+        <w:spacing w:after="140" w:before="280"/>
+      </w:pPr>
+      <w:r>
+        <w:rPr>
+          <w:b/>
+          <w:bCs/>
+          <w:i w:val="false"/>
+          <w:iCs w:val="false"/>
+          <w:color w:val="2E5395"/>
+          <w:sz w:val="24"/>
+          <w:szCs w:val="24"/>
+        </w:rPr>
+        <w:t xml:space="preserve">11.9 Archivos generados</w:t>
+      </w:r>
+    </w:p>
+    <w:p>
+      <w:pPr>
+        <w:spacing w:after="100"/>
+        <w:ind w:left="300"/>
+      </w:pPr>
+      <w:r>
+        <w:rPr>
+          <w:b/>
+          <w:bCs/>
+          <w:color w:val="1F3864"/>
+          <w:sz w:val="22"/>
+          <w:szCs w:val="22"/>
+        </w:rPr>
+        <w:t xml:space="preserve">• </w:t>
+      </w:r>
+      <w:r>
+        <w:rPr>
+          <w:rFonts w:ascii="Consolas" w:cs="Consolas" w:eastAsia="Consolas" w:hAnsi="Consolas"/>
+          <w:b w:val="false"/>
+          <w:bCs w:val="false"/>
+          <w:color w:val="C0392B"/>
+          <w:sz w:val="20"/>
+          <w:szCs w:val="20"/>
+          <w:shd w:fill="F0F0F0" w:val="clear"/>
+        </w:rPr>
+        <w:t xml:space="preserve">data/processed/pozos_con_cluster.csv</w:t>
+      </w:r>
+      <w:r>
+        <w:rPr>
+          <w:b w:val="false"/>
+          <w:bCs w:val="false"/>
+          <w:i w:val="false"/>
+          <w:iCs w:val="false"/>
+          <w:sz w:val="22"/>
+          <w:szCs w:val="22"/>
+        </w:rPr>
+        <w:t xml:space="preserve">: pozos con su cluster y valores originales.</w:t>
+      </w:r>
+    </w:p>
+    <w:p>
+      <w:pPr>
+        <w:spacing w:after="100"/>
+        <w:ind w:left="300"/>
+      </w:pPr>
+      <w:r>
+        <w:rPr>
+          <w:b/>
+          <w:bCs/>
+          <w:color w:val="1F3864"/>
+          <w:sz w:val="22"/>
+          <w:szCs w:val="22"/>
+        </w:rPr>
+        <w:t xml:space="preserve">• </w:t>
+      </w:r>
+      <w:r>
+        <w:rPr>
+          <w:rFonts w:ascii="Consolas" w:cs="Consolas" w:eastAsia="Consolas" w:hAnsi="Consolas"/>
+          <w:b w:val="false"/>
+          <w:bCs w:val="false"/>
+          <w:color w:val="C0392B"/>
+          <w:sz w:val="20"/>
+          <w:szCs w:val="20"/>
+          <w:shd w:fill="F0F0F0" w:val="clear"/>
+        </w:rPr>
+        <w:t xml:space="preserve">models/modelo_clustering_kmeans.joblib</w:t>
+      </w:r>
+      <w:r>
+        <w:rPr>
+          <w:b w:val="false"/>
+          <w:bCs w:val="false"/>
+          <w:i w:val="false"/>
+          <w:iCs w:val="false"/>
+          <w:sz w:val="22"/>
+          <w:szCs w:val="22"/>
+        </w:rPr>
+        <w:t xml:space="preserve"> y </w:t>
+      </w:r>
+      <w:r>
+        <w:rPr>
+          <w:rFonts w:ascii="Consolas" w:cs="Consolas" w:eastAsia="Consolas" w:hAnsi="Consolas"/>
+          <w:b w:val="false"/>
+          <w:bCs w:val="false"/>
+          <w:color w:val="C0392B"/>
+          <w:sz w:val="20"/>
+          <w:szCs w:val="20"/>
+          <w:shd w:fill="F0F0F0" w:val="clear"/>
+        </w:rPr>
+        <w:t xml:space="preserve">models/scaler_clustering.joblib</w:t>
+      </w:r>
+      <w:r>
+        <w:rPr>
+          <w:b w:val="false"/>
+          <w:bCs w:val="false"/>
+          <w:i w:val="false"/>
+          <w:iCs w:val="false"/>
+          <w:sz w:val="22"/>
+          <w:szCs w:val="22"/>
+        </w:rPr>
+        <w:t xml:space="preserve">: modelo y scaler entrenados.</w:t>
+      </w:r>
+    </w:p>
+    <w:p>
+      <w:pPr>
+        <w:spacing w:after="100"/>
+        <w:ind w:left="300"/>
+      </w:pPr>
+      <w:r>
+        <w:rPr>
+          <w:b/>
+          <w:bCs/>
+          <w:color w:val="1F3864"/>
+          <w:sz w:val="22"/>
+          <w:szCs w:val="22"/>
+        </w:rPr>
+        <w:t xml:space="preserve">• </w:t>
+      </w:r>
+      <w:r>
+        <w:rPr>
+          <w:rFonts w:ascii="Consolas" w:cs="Consolas" w:eastAsia="Consolas" w:hAnsi="Consolas"/>
+          <w:b w:val="false"/>
+          <w:bCs w:val="false"/>
+          <w:color w:val="C0392B"/>
+          <w:sz w:val="20"/>
+          <w:szCs w:val="20"/>
+          <w:shd w:fill="F0F0F0" w:val="clear"/>
+        </w:rPr>
+        <w:t xml:space="preserve">models/tope_declinacion_clustering.joblib</w:t>
+      </w:r>
+      <w:r>
+        <w:rPr>
+          <w:b w:val="false"/>
+          <w:bCs w:val="false"/>
+          <w:i w:val="false"/>
+          <w:iCs w:val="false"/>
+          <w:sz w:val="22"/>
+          <w:szCs w:val="22"/>
+        </w:rPr>
+        <w:t xml:space="preserve">: tope del recorte de la declinación, necesario para asignar un cluster a un pozo nuevo (recorte, logaritmo y escalado, en ese orden).</w:t>
+      </w:r>
+    </w:p>
+    <w:p>
+      <w:pPr>
+        <w:spacing w:after="160"/>
+      </w:pPr>
+    </w:p>
+    <w:p>
+      <w:pPr>
+        <w:pStyle w:val="Heading1"/>
+        <w:pBdr>
+          <w:bottom w:val="single" w:color="9DB3D6" w:sz="4" w:space="4"/>
+        </w:pBdr>
+        <w:spacing w:after="180" w:before="360"/>
+      </w:pPr>
+      <w:r>
+        <w:rPr>
+          <w:b/>
+          <w:bCs/>
+          <w:i w:val="false"/>
+          <w:iCs w:val="false"/>
+          <w:color w:val="1F3864"/>
+          <w:sz w:val="30"/>
+          <w:szCs w:val="30"/>
+        </w:rPr>
+        <w:t xml:space="preserve">12. Próximos pasos</w:t>
       </w:r>
     </w:p>
     <w:p>
@@ -8417,18 +11569,29 @@
           <w:sz w:val="22"/>
           <w:szCs w:val="22"/>
         </w:rPr>
-        <w:t xml:space="preserve">2. </w:t>
-      </w:r>
-      <w:r>
-        <w:rPr>
-          <w:b w:val="false"/>
-          <w:bCs w:val="false"/>
-          <w:i w:val="false"/>
-          <w:iCs w:val="false"/>
-          <w:sz w:val="22"/>
-          <w:szCs w:val="22"/>
-        </w:rPr>
-        <w:t xml:space="preserve">Evaluar una ronda de optimización de hiperparámetros (Optuna) y explicabilidad (SHAP) sobre el modelo de regresión, si el cronograma lo permite.</w:t>
+        <w:t xml:space="preserve">1. </w:t>
+      </w:r>
+      <w:r>
+        <w:rPr>
+          <w:b/>
+          <w:bCs/>
+          <w:i w:val="false"/>
+          <w:iCs w:val="false"/>
+          <w:sz w:val="22"/>
+          <w:szCs w:val="22"/>
+        </w:rPr>
+        <w:t xml:space="preserve">Explicabilidad:</w:t>
+      </w:r>
+      <w:r>
+        <w:rPr>
+          <w:b w:val="false"/>
+          <w:bCs w:val="false"/>
+          <w:i w:val="false"/>
+          <w:iCs w:val="false"/>
+          <w:sz w:val="22"/>
+          <w:szCs w:val="22"/>
+        </w:rPr>
+        <w:t xml:space="preserve"> aplicar SHAP sobre el modelo LightGBM final.</w:t>
       </w:r>
     </w:p>
     <w:p>
@@ -8444,18 +11607,243 @@
           <w:sz w:val="22"/>
           <w:szCs w:val="22"/>
         </w:rPr>
+        <w:t xml:space="preserve">2. </w:t>
+      </w:r>
+      <w:r>
+        <w:rPr>
+          <w:b/>
+          <w:bCs/>
+          <w:i w:val="false"/>
+          <w:iCs w:val="false"/>
+          <w:sz w:val="22"/>
+          <w:szCs w:val="22"/>
+        </w:rPr>
+        <w:t xml:space="preserve">Optimización (opcional):</w:t>
+      </w:r>
+      <w:r>
+        <w:rPr>
+          <w:b w:val="false"/>
+          <w:bCs w:val="false"/>
+          <w:i w:val="false"/>
+          <w:iCs w:val="false"/>
+          <w:sz w:val="22"/>
+          <w:szCs w:val="22"/>
+        </w:rPr>
+        <w:t xml:space="preserve"> evaluar una ronda de Optuna sobre el modelo de regresión, si el cronograma lo permite.</w:t>
+      </w:r>
+    </w:p>
+    <w:p>
+      <w:pPr>
+        <w:spacing w:after="120"/>
+        <w:ind w:left="200"/>
+      </w:pPr>
+      <w:r>
+        <w:rPr>
+          <w:b/>
+          <w:bCs/>
+          <w:color w:val="1F3864"/>
+          <w:sz w:val="22"/>
+          <w:szCs w:val="22"/>
+        </w:rPr>
         <w:t xml:space="preserve">3. </w:t>
       </w:r>
       <w:r>
         <w:rPr>
-          <w:b w:val="false"/>
-          <w:bCs w:val="false"/>
-          <w:i w:val="false"/>
-          <w:iCs w:val="false"/>
-          <w:sz w:val="22"/>
-          <w:szCs w:val="22"/>
-        </w:rPr>
-        <w:t xml:space="preserve">Entrega Final: API en FastAPI, Dockerfile y documentación completa en README.md.</w:t>
+          <w:b/>
+          <w:bCs/>
+          <w:i w:val="false"/>
+          <w:iCs w:val="false"/>
+          <w:sz w:val="22"/>
+          <w:szCs w:val="22"/>
+        </w:rPr>
+        <w:t xml:space="preserve">Entrega Final:</w:t>
+      </w:r>
+      <w:r>
+        <w:rPr>
+          <w:b w:val="false"/>
+          <w:bCs w:val="false"/>
+          <w:i w:val="false"/>
+          <w:iCs w:val="false"/>
+          <w:sz w:val="22"/>
+          <w:szCs w:val="22"/>
+        </w:rPr>
+        <w:t xml:space="preserve"> </w:t>
+      </w:r>
+      <w:r>
+        <w:rPr>
+          <w:rFonts w:ascii="Consolas" w:cs="Consolas" w:eastAsia="Consolas" w:hAnsi="Consolas"/>
+          <w:b w:val="false"/>
+          <w:bCs w:val="false"/>
+          <w:color w:val="C0392B"/>
+          <w:sz w:val="20"/>
+          <w:szCs w:val="20"/>
+          <w:shd w:fill="F0F0F0" w:val="clear"/>
+        </w:rPr>
+        <w:t xml:space="preserve">src/train.py</w:t>
+      </w:r>
+      <w:r>
+        <w:rPr>
+          <w:b w:val="false"/>
+          <w:bCs w:val="false"/>
+          <w:i w:val="false"/>
+          <w:iCs w:val="false"/>
+          <w:sz w:val="22"/>
+          <w:szCs w:val="22"/>
+        </w:rPr>
+        <w:t xml:space="preserve">, </w:t>
+      </w:r>
+      <w:r>
+        <w:rPr>
+          <w:rFonts w:ascii="Consolas" w:cs="Consolas" w:eastAsia="Consolas" w:hAnsi="Consolas"/>
+          <w:b w:val="false"/>
+          <w:bCs w:val="false"/>
+          <w:color w:val="C0392B"/>
+          <w:sz w:val="20"/>
+          <w:szCs w:val="20"/>
+          <w:shd w:fill="F0F0F0" w:val="clear"/>
+        </w:rPr>
+        <w:t xml:space="preserve">src/predict.py</w:t>
+      </w:r>
+      <w:r>
+        <w:rPr>
+          <w:b w:val="false"/>
+          <w:bCs w:val="false"/>
+          <w:i w:val="false"/>
+          <w:iCs w:val="false"/>
+          <w:sz w:val="22"/>
+          <w:szCs w:val="22"/>
+        </w:rPr>
+        <w:t xml:space="preserve">, API en FastAPI (</w:t>
+      </w:r>
+      <w:r>
+        <w:rPr>
+          <w:rFonts w:ascii="Consolas" w:cs="Consolas" w:eastAsia="Consolas" w:hAnsi="Consolas"/>
+          <w:b w:val="false"/>
+          <w:bCs w:val="false"/>
+          <w:color w:val="C0392B"/>
+          <w:sz w:val="20"/>
+          <w:szCs w:val="20"/>
+          <w:shd w:fill="F0F0F0" w:val="clear"/>
+        </w:rPr>
+        <w:t xml:space="preserve">api/app.py</w:t>
+      </w:r>
+      <w:r>
+        <w:rPr>
+          <w:b w:val="false"/>
+          <w:bCs w:val="false"/>
+          <w:i w:val="false"/>
+          <w:iCs w:val="false"/>
+          <w:sz w:val="22"/>
+          <w:szCs w:val="22"/>
+        </w:rPr>
+        <w:t xml:space="preserve"> y </w:t>
+      </w:r>
+      <w:r>
+        <w:rPr>
+          <w:rFonts w:ascii="Consolas" w:cs="Consolas" w:eastAsia="Consolas" w:hAnsi="Consolas"/>
+          <w:b w:val="false"/>
+          <w:bCs w:val="false"/>
+          <w:color w:val="C0392B"/>
+          <w:sz w:val="20"/>
+          <w:szCs w:val="20"/>
+          <w:shd w:fill="F0F0F0" w:val="clear"/>
+        </w:rPr>
+        <w:t xml:space="preserve">api/schemas.py</w:t>
+      </w:r>
+      <w:r>
+        <w:rPr>
+          <w:b w:val="false"/>
+          <w:bCs w:val="false"/>
+          <w:i w:val="false"/>
+          <w:iCs w:val="false"/>
+          <w:sz w:val="22"/>
+          <w:szCs w:val="22"/>
+        </w:rPr>
+        <w:t xml:space="preserve">), Dockerfile y documentación completa en </w:t>
+      </w:r>
+      <w:r>
+        <w:rPr>
+          <w:rFonts w:ascii="Consolas" w:cs="Consolas" w:eastAsia="Consolas" w:hAnsi="Consolas"/>
+          <w:b w:val="false"/>
+          <w:bCs w:val="false"/>
+          <w:color w:val="C0392B"/>
+          <w:sz w:val="20"/>
+          <w:szCs w:val="20"/>
+          <w:shd w:fill="F0F0F0" w:val="clear"/>
+        </w:rPr>
+        <w:t xml:space="preserve">README.md</w:t>
+      </w:r>
+      <w:r>
+        <w:rPr>
+          <w:b w:val="false"/>
+          <w:bCs w:val="false"/>
+          <w:i w:val="false"/>
+          <w:iCs w:val="false"/>
+          <w:sz w:val="22"/>
+          <w:szCs w:val="22"/>
+        </w:rPr>
+        <w:t xml:space="preserve">.</w:t>
+      </w:r>
+    </w:p>
+    <w:p>
+      <w:pPr>
+        <w:spacing w:after="120"/>
+        <w:ind w:left="200"/>
+      </w:pPr>
+      <w:r>
+        <w:rPr>
+          <w:b/>
+          <w:bCs/>
+          <w:color w:val="1F3864"/>
+          <w:sz w:val="22"/>
+          <w:szCs w:val="22"/>
+        </w:rPr>
+        <w:t xml:space="preserve">4. </w:t>
+      </w:r>
+      <w:r>
+        <w:rPr>
+          <w:b/>
+          <w:bCs/>
+          <w:i w:val="false"/>
+          <w:iCs w:val="false"/>
+          <w:sz w:val="22"/>
+          <w:szCs w:val="22"/>
+        </w:rPr>
+        <w:t xml:space="preserve">Repositorio:</w:t>
+      </w:r>
+      <w:r>
+        <w:rPr>
+          <w:b w:val="false"/>
+          <w:bCs w:val="false"/>
+          <w:i w:val="false"/>
+          <w:iCs w:val="false"/>
+          <w:sz w:val="22"/>
+          <w:szCs w:val="22"/>
+        </w:rPr>
+        <w:t xml:space="preserve"> confirmar que todo esté pusheado y mergeado a </w:t>
+      </w:r>
+      <w:r>
+        <w:rPr>
+          <w:rFonts w:ascii="Consolas" w:cs="Consolas" w:eastAsia="Consolas" w:hAnsi="Consolas"/>
+          <w:b w:val="false"/>
+          <w:bCs w:val="false"/>
+          <w:color w:val="C0392B"/>
+          <w:sz w:val="20"/>
+          <w:szCs w:val="20"/>
+          <w:shd w:fill="F0F0F0" w:val="clear"/>
+        </w:rPr>
+        <w:t xml:space="preserve">main</w:t>
+      </w:r>
+      <w:r>
+        <w:rPr>
+          <w:b w:val="false"/>
+          <w:bCs w:val="false"/>
+          <w:i w:val="false"/>
+          <w:iCs w:val="false"/>
+          <w:sz w:val="22"/>
+          <w:szCs w:val="22"/>
+        </w:rPr>
+        <w:t xml:space="preserve"> mediante Pull Request.</w:t>
       </w:r>
     </w:p>
     <w:sectPr>

</xml_diff>